<commit_message>
Date - 20 , done!
</commit_message>
<xml_diff>
--- a/Received/five/5, science.docx
+++ b/Received/five/5, science.docx
@@ -67,7 +67,16 @@
                                 <w:sz w:val="28"/>
                                 <w:szCs w:val="28"/>
                               </w:rPr>
-                              <w:t>D- 18</w:t>
+                              <w:t xml:space="preserve">D- </w:t>
+                            </w:r>
+                            <w:r>
+                              <w:rPr>
+                                <w:b/>
+                                <w:bCs/>
+                                <w:sz w:val="28"/>
+                                <w:szCs w:val="28"/>
+                              </w:rPr>
+                              <w:t>20</w:t>
                             </w:r>
                           </w:p>
                         </w:txbxContent>
@@ -104,7 +113,16 @@
                           <w:sz w:val="28"/>
                           <w:szCs w:val="28"/>
                         </w:rPr>
-                        <w:t>D- 18</w:t>
+                        <w:t xml:space="preserve">D- </w:t>
+                      </w:r>
+                      <w:r>
+                        <w:rPr>
+                          <w:b/>
+                          <w:bCs/>
+                          <w:sz w:val="28"/>
+                          <w:szCs w:val="28"/>
+                        </w:rPr>
+                        <w:t>20</w:t>
                       </w:r>
                     </w:p>
                   </w:txbxContent>
@@ -204,25 +222,7 @@
           <w:bCs/>
           <w:sz w:val="20"/>
         </w:rPr>
-        <w:t xml:space="preserve">Ratnanagar-7, </w:t>
-      </w:r>
-      <w:proofErr w:type="spellStart"/>
-      <w:r>
-        <w:rPr>
-          <w:b/>
-          <w:bCs/>
-          <w:sz w:val="20"/>
-        </w:rPr>
-        <w:t>Sauraha</w:t>
-      </w:r>
-      <w:proofErr w:type="spellEnd"/>
-      <w:r>
-        <w:rPr>
-          <w:b/>
-          <w:bCs/>
-          <w:sz w:val="20"/>
-        </w:rPr>
-        <w:t>, Chitwan</w:t>
+        <w:t>Ratnanagar-7, Sauraha, Chitwan</w:t>
       </w:r>
     </w:p>
     <w:p>
@@ -392,11 +392,19 @@
       <w:pPr>
         <w:pStyle w:val="Default"/>
         <w:suppressAutoHyphens/>
-        <w:spacing w:before="0" w:after="120" w:line="240" w:lineRule="auto"/>
-        <w:rPr>
-          <w:rFonts w:ascii="Times New Roman" w:eastAsia="Times New Roman" w:hAnsi="Times New Roman" w:cs="Times New Roman"/>
-        </w:rPr>
-      </w:pPr>
+        <w:spacing w:before="0" w:line="240" w:lineRule="auto"/>
+        <w:rPr>
+          <w:rFonts w:ascii="Times New Roman" w:eastAsia="Times New Roman" w:hAnsi="Times New Roman" w:cs="Times New Roman"/>
+        </w:rPr>
+      </w:pPr>
+      <w:r>
+        <w:rPr>
+          <w:rFonts w:ascii="Times New Roman" w:hAnsi="Times New Roman" w:cs="Times New Roman"/>
+          <w:b/>
+          <w:bCs/>
+        </w:rPr>
+        <w:t xml:space="preserve">1. </w:t>
+      </w:r>
       <w:r>
         <w:rPr>
           <w:rFonts w:ascii="Times New Roman" w:hAnsi="Times New Roman" w:cs="Times New Roman"/>
@@ -419,14 +427,6 @@
           <w:b/>
           <w:bCs/>
         </w:rPr>
-        <w:tab/>
-      </w:r>
-      <w:r>
-        <w:rPr>
-          <w:rFonts w:ascii="Times New Roman" w:hAnsi="Times New Roman" w:cs="Times New Roman"/>
-          <w:b/>
-          <w:bCs/>
-        </w:rPr>
         <w:t>(10×</w:t>
       </w:r>
       <w:r>
@@ -454,884 +454,1243 @@
           <w:b/>
           <w:bCs/>
         </w:rPr>
-        <w:t>1. What is observation?</w:t>
-      </w:r>
-    </w:p>
-    <w:p>
-      <w:pPr>
-        <w:pStyle w:val="Default"/>
-        <w:suppressAutoHyphens/>
-        <w:spacing w:before="0" w:line="240" w:lineRule="auto"/>
-        <w:rPr>
-          <w:rFonts w:ascii="Times New Roman" w:eastAsia="Times New Roman" w:hAnsi="Times New Roman" w:cs="Times New Roman"/>
-        </w:rPr>
-      </w:pPr>
-      <w:r>
-        <w:rPr>
-          <w:rFonts w:ascii="Times New Roman" w:hAnsi="Times New Roman" w:cs="Times New Roman"/>
-        </w:rPr>
-        <w:t>a) To see deeply</w:t>
-      </w:r>
-    </w:p>
-    <w:p>
-      <w:pPr>
-        <w:pStyle w:val="Default"/>
-        <w:suppressAutoHyphens/>
-        <w:spacing w:before="0" w:line="240" w:lineRule="auto"/>
-        <w:rPr>
-          <w:rFonts w:ascii="Times New Roman" w:eastAsia="Times New Roman" w:hAnsi="Times New Roman" w:cs="Times New Roman"/>
-        </w:rPr>
-      </w:pPr>
-      <w:r>
-        <w:rPr>
-          <w:rFonts w:ascii="Times New Roman" w:hAnsi="Times New Roman" w:cs="Times New Roman"/>
-        </w:rPr>
-        <w:t>b) To write properly</w:t>
-      </w:r>
-    </w:p>
-    <w:p>
-      <w:pPr>
-        <w:pStyle w:val="Default"/>
-        <w:suppressAutoHyphens/>
-        <w:spacing w:before="0" w:line="240" w:lineRule="auto"/>
-        <w:rPr>
-          <w:rFonts w:ascii="Times New Roman" w:eastAsia="Times New Roman" w:hAnsi="Times New Roman" w:cs="Times New Roman"/>
-        </w:rPr>
-      </w:pPr>
-      <w:r>
-        <w:rPr>
-          <w:rFonts w:ascii="Times New Roman" w:hAnsi="Times New Roman" w:cs="Times New Roman"/>
-        </w:rPr>
-        <w:t>c) To read deeply</w:t>
-      </w:r>
-    </w:p>
-    <w:p>
-      <w:pPr>
-        <w:pStyle w:val="Default"/>
-        <w:suppressAutoHyphens/>
-        <w:spacing w:before="0" w:after="120" w:line="240" w:lineRule="auto"/>
-        <w:rPr>
-          <w:rFonts w:ascii="Times New Roman" w:eastAsia="Times New Roman" w:hAnsi="Times New Roman" w:cs="Times New Roman"/>
-        </w:rPr>
-      </w:pPr>
-      <w:r>
-        <w:rPr>
-          <w:rFonts w:ascii="Times New Roman" w:hAnsi="Times New Roman" w:cs="Times New Roman"/>
-        </w:rPr>
-        <w:t>d) To speak properly</w:t>
-      </w:r>
-    </w:p>
-    <w:p>
-      <w:pPr>
-        <w:pStyle w:val="Default"/>
-        <w:suppressAutoHyphens/>
-        <w:spacing w:before="0" w:line="240" w:lineRule="auto"/>
-        <w:rPr>
-          <w:rFonts w:ascii="Times New Roman" w:eastAsia="Times New Roman" w:hAnsi="Times New Roman" w:cs="Times New Roman"/>
-        </w:rPr>
-      </w:pPr>
-      <w:r>
-        <w:rPr>
-          <w:rFonts w:ascii="Times New Roman" w:hAnsi="Times New Roman" w:cs="Times New Roman"/>
-          <w:b/>
-          <w:bCs/>
-        </w:rPr>
-        <w:t>2. Which energy does a ringing bell have?</w:t>
-      </w:r>
-    </w:p>
-    <w:p>
-      <w:pPr>
-        <w:pStyle w:val="Default"/>
-        <w:suppressAutoHyphens/>
-        <w:spacing w:before="0" w:line="240" w:lineRule="auto"/>
-        <w:rPr>
-          <w:rFonts w:ascii="Times New Roman" w:eastAsia="Times New Roman" w:hAnsi="Times New Roman" w:cs="Times New Roman"/>
-        </w:rPr>
-      </w:pPr>
-      <w:r>
-        <w:rPr>
-          <w:rFonts w:ascii="Times New Roman" w:hAnsi="Times New Roman" w:cs="Times New Roman"/>
-        </w:rPr>
-        <w:t>a) Sound energy</w:t>
-      </w:r>
-    </w:p>
-    <w:p>
-      <w:pPr>
-        <w:pStyle w:val="Default"/>
-        <w:suppressAutoHyphens/>
-        <w:spacing w:before="0" w:line="240" w:lineRule="auto"/>
-        <w:rPr>
-          <w:rFonts w:ascii="Times New Roman" w:eastAsia="Times New Roman" w:hAnsi="Times New Roman" w:cs="Times New Roman"/>
-        </w:rPr>
-      </w:pPr>
-      <w:r>
-        <w:rPr>
-          <w:rFonts w:ascii="Times New Roman" w:hAnsi="Times New Roman" w:cs="Times New Roman"/>
-        </w:rPr>
-        <w:t>b) Chemical energy</w:t>
-      </w:r>
-    </w:p>
-    <w:p>
-      <w:pPr>
-        <w:pStyle w:val="Default"/>
-        <w:suppressAutoHyphens/>
-        <w:spacing w:before="0" w:line="240" w:lineRule="auto"/>
-        <w:rPr>
-          <w:rFonts w:ascii="Times New Roman" w:eastAsia="Times New Roman" w:hAnsi="Times New Roman" w:cs="Times New Roman"/>
-        </w:rPr>
-      </w:pPr>
-      <w:r>
-        <w:rPr>
-          <w:rFonts w:ascii="Times New Roman" w:hAnsi="Times New Roman" w:cs="Times New Roman"/>
-        </w:rPr>
-        <w:t>c) Electric energy</w:t>
-      </w:r>
-    </w:p>
-    <w:p>
-      <w:pPr>
-        <w:pStyle w:val="Default"/>
-        <w:suppressAutoHyphens/>
-        <w:spacing w:before="0" w:after="120" w:line="240" w:lineRule="auto"/>
-        <w:rPr>
-          <w:rFonts w:ascii="Times New Roman" w:eastAsia="Times New Roman" w:hAnsi="Times New Roman" w:cs="Times New Roman"/>
-        </w:rPr>
-      </w:pPr>
+        <w:t>a</w:t>
+      </w:r>
+      <w:r>
+        <w:rPr>
+          <w:rFonts w:ascii="Times New Roman" w:hAnsi="Times New Roman" w:cs="Times New Roman"/>
+          <w:b/>
+          <w:bCs/>
+        </w:rPr>
+        <w:t>. What is observation?</w:t>
+      </w:r>
+    </w:p>
+    <w:p>
+      <w:pPr>
+        <w:pStyle w:val="Default"/>
+        <w:suppressAutoHyphens/>
+        <w:spacing w:before="0" w:line="240" w:lineRule="auto"/>
+        <w:rPr>
+          <w:rFonts w:ascii="Times New Roman" w:eastAsia="Times New Roman" w:hAnsi="Times New Roman" w:cs="Times New Roman"/>
+        </w:rPr>
+      </w:pPr>
+      <w:r>
+        <w:rPr>
+          <w:rFonts w:ascii="Times New Roman" w:hAnsi="Times New Roman" w:cs="Times New Roman"/>
+        </w:rPr>
+        <w:t>i</w:t>
+      </w:r>
+      <w:r>
+        <w:rPr>
+          <w:rFonts w:ascii="Times New Roman" w:hAnsi="Times New Roman" w:cs="Times New Roman"/>
+        </w:rPr>
+        <w:t>) To see deeply</w:t>
+      </w:r>
+      <w:r>
+        <w:rPr>
+          <w:rFonts w:ascii="Times New Roman" w:hAnsi="Times New Roman" w:cs="Times New Roman"/>
+        </w:rPr>
+        <w:tab/>
+      </w:r>
+      <w:r>
+        <w:rPr>
+          <w:rFonts w:ascii="Times New Roman" w:hAnsi="Times New Roman" w:cs="Times New Roman"/>
+        </w:rPr>
+        <w:tab/>
+      </w:r>
+      <w:r>
+        <w:rPr>
+          <w:rFonts w:ascii="Times New Roman" w:hAnsi="Times New Roman" w:cs="Times New Roman"/>
+        </w:rPr>
+        <w:t>i</w:t>
+      </w:r>
+      <w:r>
+        <w:rPr>
+          <w:rFonts w:ascii="Times New Roman" w:hAnsi="Times New Roman" w:cs="Times New Roman"/>
+        </w:rPr>
+        <w:t>) To write properly</w:t>
+      </w:r>
+    </w:p>
+    <w:p>
+      <w:pPr>
+        <w:pStyle w:val="Default"/>
+        <w:suppressAutoHyphens/>
+        <w:spacing w:before="0" w:line="240" w:lineRule="auto"/>
+        <w:rPr>
+          <w:rFonts w:ascii="Times New Roman" w:eastAsia="Times New Roman" w:hAnsi="Times New Roman" w:cs="Times New Roman"/>
+        </w:rPr>
+      </w:pPr>
+      <w:r>
+        <w:rPr>
+          <w:rFonts w:ascii="Times New Roman" w:hAnsi="Times New Roman" w:cs="Times New Roman"/>
+        </w:rPr>
+        <w:t>iii</w:t>
+      </w:r>
+      <w:r>
+        <w:rPr>
+          <w:rFonts w:ascii="Times New Roman" w:hAnsi="Times New Roman" w:cs="Times New Roman"/>
+        </w:rPr>
+        <w:t>) To read deeply</w:t>
+      </w:r>
+      <w:r>
+        <w:rPr>
+          <w:rFonts w:ascii="Times New Roman" w:hAnsi="Times New Roman" w:cs="Times New Roman"/>
+        </w:rPr>
+        <w:tab/>
+      </w:r>
+      <w:r>
+        <w:rPr>
+          <w:rFonts w:ascii="Times New Roman" w:hAnsi="Times New Roman" w:cs="Times New Roman"/>
+        </w:rPr>
+        <w:tab/>
+      </w:r>
+      <w:r>
+        <w:rPr>
+          <w:rFonts w:ascii="Times New Roman" w:hAnsi="Times New Roman" w:cs="Times New Roman"/>
+        </w:rPr>
+        <w:t>iv</w:t>
+      </w:r>
+      <w:r>
+        <w:rPr>
+          <w:rFonts w:ascii="Times New Roman" w:hAnsi="Times New Roman" w:cs="Times New Roman"/>
+        </w:rPr>
+        <w:t>) To speak properly</w:t>
+      </w:r>
+    </w:p>
+    <w:p>
+      <w:pPr>
+        <w:pStyle w:val="Default"/>
+        <w:suppressAutoHyphens/>
+        <w:spacing w:before="0" w:line="240" w:lineRule="auto"/>
+        <w:rPr>
+          <w:rFonts w:ascii="Times New Roman" w:eastAsia="Times New Roman" w:hAnsi="Times New Roman" w:cs="Times New Roman"/>
+        </w:rPr>
+      </w:pPr>
+      <w:r>
+        <w:rPr>
+          <w:rFonts w:ascii="Times New Roman" w:hAnsi="Times New Roman" w:cs="Times New Roman"/>
+          <w:b/>
+          <w:bCs/>
+        </w:rPr>
+        <w:t>b</w:t>
+      </w:r>
+      <w:r>
+        <w:rPr>
+          <w:rFonts w:ascii="Times New Roman" w:hAnsi="Times New Roman" w:cs="Times New Roman"/>
+          <w:b/>
+          <w:bCs/>
+        </w:rPr>
+        <w:t>. Which energy does a ringing bell have?</w:t>
+      </w:r>
+    </w:p>
+    <w:p>
+      <w:pPr>
+        <w:pStyle w:val="Default"/>
+        <w:suppressAutoHyphens/>
+        <w:spacing w:before="0" w:line="240" w:lineRule="auto"/>
+        <w:rPr>
+          <w:rFonts w:ascii="Times New Roman" w:eastAsia="Times New Roman" w:hAnsi="Times New Roman" w:cs="Times New Roman"/>
+        </w:rPr>
+      </w:pPr>
+      <w:r>
+        <w:rPr>
+          <w:rFonts w:ascii="Times New Roman" w:hAnsi="Times New Roman" w:cs="Times New Roman"/>
+        </w:rPr>
+        <w:t>i</w:t>
+      </w:r>
+      <w:r>
+        <w:rPr>
+          <w:rFonts w:ascii="Times New Roman" w:hAnsi="Times New Roman" w:cs="Times New Roman"/>
+        </w:rPr>
+        <w:t>) Sound energy</w:t>
+      </w:r>
+      <w:r>
+        <w:rPr>
+          <w:rFonts w:ascii="Times New Roman" w:hAnsi="Times New Roman" w:cs="Times New Roman"/>
+        </w:rPr>
+        <w:tab/>
+      </w:r>
+      <w:r>
+        <w:rPr>
+          <w:rFonts w:ascii="Times New Roman" w:hAnsi="Times New Roman" w:cs="Times New Roman"/>
+        </w:rPr>
+        <w:tab/>
+      </w:r>
+      <w:r>
+        <w:rPr>
+          <w:rFonts w:ascii="Times New Roman" w:hAnsi="Times New Roman" w:cs="Times New Roman"/>
+        </w:rPr>
+        <w:t>ii</w:t>
+      </w:r>
+      <w:r>
+        <w:rPr>
+          <w:rFonts w:ascii="Times New Roman" w:hAnsi="Times New Roman" w:cs="Times New Roman"/>
+        </w:rPr>
+        <w:t>) Chemical energy</w:t>
+      </w:r>
+    </w:p>
+    <w:p>
+      <w:pPr>
+        <w:pStyle w:val="Default"/>
+        <w:suppressAutoHyphens/>
+        <w:spacing w:before="0" w:line="240" w:lineRule="auto"/>
+        <w:rPr>
+          <w:rFonts w:ascii="Times New Roman" w:eastAsia="Times New Roman" w:hAnsi="Times New Roman" w:cs="Times New Roman"/>
+        </w:rPr>
+      </w:pPr>
+      <w:r>
+        <w:rPr>
+          <w:rFonts w:ascii="Times New Roman" w:hAnsi="Times New Roman" w:cs="Times New Roman"/>
+        </w:rPr>
+        <w:t>iii</w:t>
+      </w:r>
+      <w:r>
+        <w:rPr>
+          <w:rFonts w:ascii="Times New Roman" w:hAnsi="Times New Roman" w:cs="Times New Roman"/>
+        </w:rPr>
+        <w:t>) Electric energy</w:t>
+      </w:r>
+      <w:r>
+        <w:rPr>
+          <w:rFonts w:ascii="Times New Roman" w:hAnsi="Times New Roman" w:cs="Times New Roman"/>
+        </w:rPr>
+        <w:tab/>
+      </w:r>
+      <w:r>
+        <w:rPr>
+          <w:rFonts w:ascii="Times New Roman" w:hAnsi="Times New Roman" w:cs="Times New Roman"/>
+        </w:rPr>
+        <w:tab/>
+      </w:r>
       <w:r>
         <w:rPr>
           <w:rFonts w:ascii="Times New Roman" w:hAnsi="Times New Roman" w:cs="Times New Roman"/>
           <w:lang w:val="fr-FR"/>
         </w:rPr>
-        <w:t xml:space="preserve">d) Motion </w:t>
-      </w:r>
-      <w:proofErr w:type="spellStart"/>
+        <w:t>iv</w:t>
+      </w:r>
       <w:r>
         <w:rPr>
           <w:rFonts w:ascii="Times New Roman" w:hAnsi="Times New Roman" w:cs="Times New Roman"/>
           <w:lang w:val="fr-FR"/>
         </w:rPr>
-        <w:t>energy</w:t>
-      </w:r>
-      <w:proofErr w:type="spellEnd"/>
-    </w:p>
-    <w:p>
-      <w:pPr>
-        <w:pStyle w:val="Default"/>
-        <w:suppressAutoHyphens/>
-        <w:spacing w:before="0" w:line="240" w:lineRule="auto"/>
-        <w:rPr>
-          <w:rFonts w:ascii="Times New Roman" w:eastAsia="Times New Roman" w:hAnsi="Times New Roman" w:cs="Times New Roman"/>
-        </w:rPr>
-      </w:pPr>
-      <w:r>
-        <w:rPr>
-          <w:rFonts w:ascii="Times New Roman" w:hAnsi="Times New Roman" w:cs="Times New Roman"/>
-          <w:b/>
-          <w:bCs/>
-        </w:rPr>
-        <w:t>3. Which gas is taken by plants for respiration?</w:t>
-      </w:r>
-    </w:p>
-    <w:p>
-      <w:pPr>
-        <w:pStyle w:val="Default"/>
-        <w:suppressAutoHyphens/>
-        <w:spacing w:before="0" w:line="240" w:lineRule="auto"/>
-        <w:rPr>
-          <w:rFonts w:ascii="Times New Roman" w:eastAsia="Times New Roman" w:hAnsi="Times New Roman" w:cs="Times New Roman"/>
-        </w:rPr>
-      </w:pPr>
-      <w:r>
-        <w:rPr>
-          <w:rFonts w:ascii="Times New Roman" w:hAnsi="Times New Roman" w:cs="Times New Roman"/>
-        </w:rPr>
-        <w:t>a) Oxygen</w:t>
-      </w:r>
-    </w:p>
-    <w:p>
-      <w:pPr>
-        <w:pStyle w:val="Default"/>
-        <w:suppressAutoHyphens/>
-        <w:spacing w:before="0" w:line="240" w:lineRule="auto"/>
-        <w:rPr>
-          <w:rFonts w:ascii="Times New Roman" w:eastAsia="Times New Roman" w:hAnsi="Times New Roman" w:cs="Times New Roman"/>
-        </w:rPr>
-      </w:pPr>
+        <w:t xml:space="preserve">) Motion </w:t>
+      </w:r>
+      <w:r>
+        <w:rPr>
+          <w:rFonts w:ascii="Times New Roman" w:hAnsi="Times New Roman" w:cs="Times New Roman"/>
+          <w:lang w:val="fr-FR"/>
+        </w:rPr>
+        <w:t>Energy</w:t>
+      </w:r>
+    </w:p>
+    <w:p>
+      <w:pPr>
+        <w:pStyle w:val="Default"/>
+        <w:suppressAutoHyphens/>
+        <w:spacing w:before="0" w:line="240" w:lineRule="auto"/>
+        <w:rPr>
+          <w:rFonts w:ascii="Times New Roman" w:eastAsia="Times New Roman" w:hAnsi="Times New Roman" w:cs="Times New Roman"/>
+        </w:rPr>
+      </w:pPr>
+      <w:r>
+        <w:rPr>
+          <w:rFonts w:ascii="Times New Roman" w:hAnsi="Times New Roman" w:cs="Times New Roman"/>
+          <w:b/>
+          <w:bCs/>
+        </w:rPr>
+        <w:t>c</w:t>
+      </w:r>
+      <w:r>
+        <w:rPr>
+          <w:rFonts w:ascii="Times New Roman" w:hAnsi="Times New Roman" w:cs="Times New Roman"/>
+          <w:b/>
+          <w:bCs/>
+        </w:rPr>
+        <w:t>. Which gas is taken by plants for respiration?</w:t>
+      </w:r>
+    </w:p>
+    <w:p>
+      <w:pPr>
+        <w:pStyle w:val="Default"/>
+        <w:suppressAutoHyphens/>
+        <w:spacing w:before="0" w:line="240" w:lineRule="auto"/>
+        <w:rPr>
+          <w:rFonts w:ascii="Times New Roman" w:eastAsia="Times New Roman" w:hAnsi="Times New Roman" w:cs="Times New Roman"/>
+        </w:rPr>
+      </w:pPr>
+      <w:r>
+        <w:rPr>
+          <w:rFonts w:ascii="Times New Roman" w:hAnsi="Times New Roman" w:cs="Times New Roman"/>
+        </w:rPr>
+        <w:t>i</w:t>
+      </w:r>
+      <w:r>
+        <w:rPr>
+          <w:rFonts w:ascii="Times New Roman" w:hAnsi="Times New Roman" w:cs="Times New Roman"/>
+        </w:rPr>
+        <w:t>) Oxygen</w:t>
+      </w:r>
+      <w:r>
+        <w:rPr>
+          <w:rFonts w:ascii="Times New Roman" w:hAnsi="Times New Roman" w:cs="Times New Roman"/>
+        </w:rPr>
+        <w:tab/>
+      </w:r>
+      <w:r>
+        <w:rPr>
+          <w:rFonts w:ascii="Times New Roman" w:hAnsi="Times New Roman" w:cs="Times New Roman"/>
+        </w:rPr>
+        <w:tab/>
+      </w:r>
+      <w:r>
+        <w:rPr>
+          <w:rFonts w:ascii="Times New Roman" w:hAnsi="Times New Roman" w:cs="Times New Roman"/>
+        </w:rPr>
+        <w:tab/>
+      </w:r>
       <w:r>
         <w:rPr>
           <w:rFonts w:ascii="Times New Roman" w:hAnsi="Times New Roman" w:cs="Times New Roman"/>
           <w:lang w:val="it-IT"/>
         </w:rPr>
-        <w:t>b) Nitrogen</w:t>
-      </w:r>
-    </w:p>
-    <w:p>
-      <w:pPr>
-        <w:pStyle w:val="Default"/>
-        <w:suppressAutoHyphens/>
-        <w:spacing w:before="0" w:line="240" w:lineRule="auto"/>
-        <w:rPr>
-          <w:rFonts w:ascii="Times New Roman" w:eastAsia="Times New Roman" w:hAnsi="Times New Roman" w:cs="Times New Roman"/>
-        </w:rPr>
-      </w:pPr>
-      <w:r>
-        <w:rPr>
-          <w:rFonts w:ascii="Times New Roman" w:hAnsi="Times New Roman" w:cs="Times New Roman"/>
-        </w:rPr>
-        <w:t>c) Carbon dioxide</w:t>
-      </w:r>
-    </w:p>
-    <w:p>
-      <w:pPr>
-        <w:pStyle w:val="Default"/>
-        <w:suppressAutoHyphens/>
-        <w:spacing w:before="0" w:after="120" w:line="240" w:lineRule="auto"/>
-        <w:rPr>
-          <w:rFonts w:ascii="Times New Roman" w:eastAsia="Times New Roman" w:hAnsi="Times New Roman" w:cs="Times New Roman"/>
-        </w:rPr>
-      </w:pPr>
+        <w:t>iv</w:t>
+      </w:r>
       <w:r>
         <w:rPr>
           <w:rFonts w:ascii="Times New Roman" w:hAnsi="Times New Roman" w:cs="Times New Roman"/>
           <w:lang w:val="it-IT"/>
         </w:rPr>
-        <w:t>d) Hydrogen</w:t>
-      </w:r>
-    </w:p>
-    <w:p>
-      <w:pPr>
-        <w:pStyle w:val="Default"/>
-        <w:suppressAutoHyphens/>
-        <w:spacing w:before="0" w:line="240" w:lineRule="auto"/>
-        <w:rPr>
-          <w:rFonts w:ascii="Times New Roman" w:eastAsia="Times New Roman" w:hAnsi="Times New Roman" w:cs="Times New Roman"/>
-        </w:rPr>
-      </w:pPr>
-      <w:r>
-        <w:rPr>
-          <w:rFonts w:ascii="Times New Roman" w:hAnsi="Times New Roman" w:cs="Times New Roman"/>
-          <w:b/>
-          <w:bCs/>
-        </w:rPr>
-        <w:t>4. Which of the following is a natural source of light?</w:t>
-      </w:r>
-    </w:p>
-    <w:p>
-      <w:pPr>
-        <w:pStyle w:val="Default"/>
-        <w:suppressAutoHyphens/>
-        <w:spacing w:before="0" w:line="240" w:lineRule="auto"/>
-        <w:rPr>
-          <w:rFonts w:ascii="Times New Roman" w:eastAsia="Times New Roman" w:hAnsi="Times New Roman" w:cs="Times New Roman"/>
-        </w:rPr>
-      </w:pPr>
-      <w:r>
-        <w:rPr>
-          <w:rFonts w:ascii="Times New Roman" w:hAnsi="Times New Roman" w:cs="Times New Roman"/>
-        </w:rPr>
-        <w:t>a) The Sun</w:t>
-      </w:r>
-    </w:p>
-    <w:p>
-      <w:pPr>
-        <w:pStyle w:val="Default"/>
-        <w:suppressAutoHyphens/>
-        <w:spacing w:before="0" w:line="240" w:lineRule="auto"/>
-        <w:rPr>
-          <w:rFonts w:ascii="Times New Roman" w:eastAsia="Times New Roman" w:hAnsi="Times New Roman" w:cs="Times New Roman"/>
-        </w:rPr>
-      </w:pPr>
-      <w:r>
-        <w:rPr>
-          <w:rFonts w:ascii="Times New Roman" w:hAnsi="Times New Roman" w:cs="Times New Roman"/>
-        </w:rPr>
-        <w:t>b) Tube light</w:t>
-      </w:r>
-    </w:p>
-    <w:p>
-      <w:pPr>
-        <w:pStyle w:val="Default"/>
-        <w:suppressAutoHyphens/>
-        <w:spacing w:before="0" w:line="240" w:lineRule="auto"/>
-        <w:rPr>
-          <w:rFonts w:ascii="Times New Roman" w:eastAsia="Times New Roman" w:hAnsi="Times New Roman" w:cs="Times New Roman"/>
-        </w:rPr>
-      </w:pPr>
-      <w:r>
-        <w:rPr>
-          <w:rFonts w:ascii="Times New Roman" w:hAnsi="Times New Roman" w:cs="Times New Roman"/>
-        </w:rPr>
-        <w:t>c) Candle</w:t>
-      </w:r>
-    </w:p>
-    <w:p>
-      <w:pPr>
-        <w:pStyle w:val="Default"/>
-        <w:suppressAutoHyphens/>
-        <w:spacing w:before="0" w:after="120" w:line="240" w:lineRule="auto"/>
-        <w:rPr>
-          <w:rFonts w:ascii="Times New Roman" w:eastAsia="Times New Roman" w:hAnsi="Times New Roman" w:cs="Times New Roman"/>
-        </w:rPr>
-      </w:pPr>
-      <w:r>
-        <w:rPr>
-          <w:rFonts w:ascii="Times New Roman" w:hAnsi="Times New Roman" w:cs="Times New Roman"/>
-        </w:rPr>
-        <w:t>d) Bulb</w:t>
-      </w:r>
-    </w:p>
-    <w:p>
-      <w:pPr>
-        <w:pStyle w:val="Default"/>
-        <w:suppressAutoHyphens/>
-        <w:spacing w:before="0" w:line="240" w:lineRule="auto"/>
-        <w:rPr>
-          <w:rFonts w:ascii="Times New Roman" w:eastAsia="Times New Roman" w:hAnsi="Times New Roman" w:cs="Times New Roman"/>
-        </w:rPr>
-      </w:pPr>
-      <w:r>
-        <w:rPr>
-          <w:rFonts w:ascii="Times New Roman" w:hAnsi="Times New Roman" w:cs="Times New Roman"/>
-          <w:b/>
-          <w:bCs/>
-        </w:rPr>
-        <w:t>5. Which of the following is a renewable source of energy?</w:t>
-      </w:r>
-    </w:p>
-    <w:p>
-      <w:pPr>
-        <w:pStyle w:val="Default"/>
-        <w:suppressAutoHyphens/>
-        <w:spacing w:before="0" w:line="240" w:lineRule="auto"/>
-        <w:rPr>
-          <w:rFonts w:ascii="Times New Roman" w:eastAsia="Times New Roman" w:hAnsi="Times New Roman" w:cs="Times New Roman"/>
-        </w:rPr>
-      </w:pPr>
-      <w:r>
-        <w:rPr>
-          <w:rFonts w:ascii="Times New Roman" w:hAnsi="Times New Roman" w:cs="Times New Roman"/>
-        </w:rPr>
-        <w:t>a) Solar energy</w:t>
-      </w:r>
-    </w:p>
-    <w:p>
-      <w:pPr>
-        <w:pStyle w:val="Default"/>
-        <w:suppressAutoHyphens/>
-        <w:spacing w:before="0" w:line="240" w:lineRule="auto"/>
-        <w:rPr>
-          <w:rFonts w:ascii="Times New Roman" w:eastAsia="Times New Roman" w:hAnsi="Times New Roman" w:cs="Times New Roman"/>
-        </w:rPr>
-      </w:pPr>
-      <w:r>
-        <w:rPr>
-          <w:rFonts w:ascii="Times New Roman" w:hAnsi="Times New Roman" w:cs="Times New Roman"/>
-        </w:rPr>
-        <w:t>b) Coal</w:t>
-      </w:r>
-    </w:p>
-    <w:p>
-      <w:pPr>
-        <w:pStyle w:val="Default"/>
-        <w:suppressAutoHyphens/>
-        <w:spacing w:before="0" w:line="240" w:lineRule="auto"/>
-        <w:rPr>
-          <w:rFonts w:ascii="Times New Roman" w:eastAsia="Times New Roman" w:hAnsi="Times New Roman" w:cs="Times New Roman"/>
-        </w:rPr>
-      </w:pPr>
-      <w:r>
-        <w:rPr>
-          <w:rFonts w:ascii="Times New Roman" w:hAnsi="Times New Roman" w:cs="Times New Roman"/>
-        </w:rPr>
-        <w:t>c) Kerosene</w:t>
-      </w:r>
-    </w:p>
-    <w:p>
-      <w:pPr>
-        <w:pStyle w:val="Default"/>
-        <w:suppressAutoHyphens/>
-        <w:spacing w:before="0" w:after="120" w:line="240" w:lineRule="auto"/>
-        <w:rPr>
-          <w:rFonts w:ascii="Times New Roman" w:eastAsia="Times New Roman" w:hAnsi="Times New Roman" w:cs="Times New Roman"/>
-        </w:rPr>
-      </w:pPr>
-      <w:r>
-        <w:rPr>
-          <w:rFonts w:ascii="Times New Roman" w:hAnsi="Times New Roman" w:cs="Times New Roman"/>
-        </w:rPr>
-        <w:t>d) Petrol</w:t>
-      </w:r>
-    </w:p>
-    <w:p>
-      <w:pPr>
-        <w:pStyle w:val="Default"/>
-        <w:suppressAutoHyphens/>
-        <w:spacing w:before="0" w:line="240" w:lineRule="auto"/>
-        <w:rPr>
-          <w:rFonts w:ascii="Times New Roman" w:eastAsia="Times New Roman" w:hAnsi="Times New Roman" w:cs="Times New Roman"/>
-        </w:rPr>
-      </w:pPr>
-      <w:r>
-        <w:rPr>
-          <w:rFonts w:ascii="Times New Roman" w:hAnsi="Times New Roman" w:cs="Times New Roman"/>
-          <w:b/>
-          <w:bCs/>
-        </w:rPr>
-        <w:t>6. Which energy is required for the process of photosynthesis?</w:t>
-      </w:r>
-    </w:p>
-    <w:p>
-      <w:pPr>
-        <w:pStyle w:val="Default"/>
-        <w:suppressAutoHyphens/>
-        <w:spacing w:before="0" w:line="240" w:lineRule="auto"/>
-        <w:rPr>
-          <w:rFonts w:ascii="Times New Roman" w:eastAsia="Times New Roman" w:hAnsi="Times New Roman" w:cs="Times New Roman"/>
-        </w:rPr>
-      </w:pPr>
-      <w:r>
-        <w:rPr>
-          <w:rFonts w:ascii="Times New Roman" w:hAnsi="Times New Roman" w:cs="Times New Roman"/>
-        </w:rPr>
-        <w:t>a) Sound energy</w:t>
-      </w:r>
-    </w:p>
-    <w:p>
-      <w:pPr>
-        <w:pStyle w:val="Default"/>
-        <w:suppressAutoHyphens/>
-        <w:spacing w:before="0" w:line="240" w:lineRule="auto"/>
-        <w:rPr>
-          <w:rFonts w:ascii="Times New Roman" w:eastAsia="Times New Roman" w:hAnsi="Times New Roman" w:cs="Times New Roman"/>
-        </w:rPr>
-      </w:pPr>
-      <w:r>
-        <w:rPr>
-          <w:rFonts w:ascii="Times New Roman" w:hAnsi="Times New Roman" w:cs="Times New Roman"/>
-        </w:rPr>
-        <w:t>b) Light energy</w:t>
-      </w:r>
-    </w:p>
-    <w:p>
-      <w:pPr>
-        <w:pStyle w:val="Default"/>
-        <w:suppressAutoHyphens/>
-        <w:spacing w:before="0" w:line="240" w:lineRule="auto"/>
-        <w:rPr>
-          <w:rFonts w:ascii="Times New Roman" w:eastAsia="Times New Roman" w:hAnsi="Times New Roman" w:cs="Times New Roman"/>
-        </w:rPr>
-      </w:pPr>
-      <w:r>
-        <w:rPr>
-          <w:rFonts w:ascii="Times New Roman" w:hAnsi="Times New Roman" w:cs="Times New Roman"/>
-        </w:rPr>
-        <w:t>c) Heat energy</w:t>
-      </w:r>
-    </w:p>
-    <w:p>
-      <w:pPr>
-        <w:pStyle w:val="Default"/>
-        <w:suppressAutoHyphens/>
-        <w:spacing w:before="0" w:after="120" w:line="240" w:lineRule="auto"/>
-        <w:rPr>
-          <w:rFonts w:ascii="Times New Roman" w:eastAsia="Times New Roman" w:hAnsi="Times New Roman" w:cs="Times New Roman"/>
-        </w:rPr>
-      </w:pPr>
-      <w:r>
-        <w:rPr>
-          <w:rFonts w:ascii="Times New Roman" w:hAnsi="Times New Roman" w:cs="Times New Roman"/>
-        </w:rPr>
-        <w:t>d) Magnetic energy</w:t>
-      </w:r>
-    </w:p>
-    <w:p>
-      <w:pPr>
-        <w:pStyle w:val="Default"/>
-        <w:suppressAutoHyphens/>
-        <w:spacing w:before="0" w:line="240" w:lineRule="auto"/>
-        <w:rPr>
-          <w:rFonts w:ascii="Times New Roman" w:eastAsia="Times New Roman" w:hAnsi="Times New Roman" w:cs="Times New Roman"/>
-        </w:rPr>
-      </w:pPr>
-      <w:r>
-        <w:rPr>
-          <w:rFonts w:ascii="Times New Roman" w:hAnsi="Times New Roman" w:cs="Times New Roman"/>
-          <w:b/>
-          <w:bCs/>
-        </w:rPr>
-        <w:t>7. In which part of the human body is food absorbed?</w:t>
-      </w:r>
-    </w:p>
-    <w:p>
-      <w:pPr>
-        <w:pStyle w:val="Default"/>
-        <w:suppressAutoHyphens/>
-        <w:spacing w:before="0" w:line="240" w:lineRule="auto"/>
-        <w:rPr>
-          <w:rFonts w:ascii="Times New Roman" w:eastAsia="Times New Roman" w:hAnsi="Times New Roman" w:cs="Times New Roman"/>
-        </w:rPr>
-      </w:pPr>
-      <w:r>
-        <w:rPr>
-          <w:rFonts w:ascii="Times New Roman" w:hAnsi="Times New Roman" w:cs="Times New Roman"/>
-        </w:rPr>
-        <w:t xml:space="preserve">a) </w:t>
-      </w:r>
-      <w:proofErr w:type="gramStart"/>
-      <w:r>
-        <w:rPr>
-          <w:rFonts w:ascii="Times New Roman" w:hAnsi="Times New Roman" w:cs="Times New Roman"/>
-        </w:rPr>
-        <w:t>Small</w:t>
-      </w:r>
-      <w:proofErr w:type="gramEnd"/>
-      <w:r>
-        <w:rPr>
-          <w:rFonts w:ascii="Times New Roman" w:hAnsi="Times New Roman" w:cs="Times New Roman"/>
-        </w:rPr>
-        <w:t xml:space="preserve"> intestine</w:t>
-      </w:r>
-    </w:p>
-    <w:p>
-      <w:pPr>
-        <w:pStyle w:val="Default"/>
-        <w:suppressAutoHyphens/>
-        <w:spacing w:before="0" w:line="240" w:lineRule="auto"/>
-        <w:rPr>
-          <w:rFonts w:ascii="Times New Roman" w:eastAsia="Times New Roman" w:hAnsi="Times New Roman" w:cs="Times New Roman"/>
-        </w:rPr>
-      </w:pPr>
+        <w:t>) Nitrogen</w:t>
+      </w:r>
+    </w:p>
+    <w:p>
+      <w:pPr>
+        <w:pStyle w:val="Default"/>
+        <w:suppressAutoHyphens/>
+        <w:spacing w:before="0" w:line="240" w:lineRule="auto"/>
+        <w:rPr>
+          <w:rFonts w:ascii="Times New Roman" w:eastAsia="Times New Roman" w:hAnsi="Times New Roman" w:cs="Times New Roman"/>
+        </w:rPr>
+      </w:pPr>
+      <w:r>
+        <w:rPr>
+          <w:rFonts w:ascii="Times New Roman" w:hAnsi="Times New Roman" w:cs="Times New Roman"/>
+        </w:rPr>
+        <w:t>iii</w:t>
+      </w:r>
+      <w:r>
+        <w:rPr>
+          <w:rFonts w:ascii="Times New Roman" w:hAnsi="Times New Roman" w:cs="Times New Roman"/>
+        </w:rPr>
+        <w:t>) Carbon dioxide</w:t>
+      </w:r>
+      <w:r>
+        <w:rPr>
+          <w:rFonts w:ascii="Times New Roman" w:hAnsi="Times New Roman" w:cs="Times New Roman"/>
+        </w:rPr>
+        <w:tab/>
+      </w:r>
+      <w:r>
+        <w:rPr>
+          <w:rFonts w:ascii="Times New Roman" w:hAnsi="Times New Roman" w:cs="Times New Roman"/>
+        </w:rPr>
+        <w:tab/>
+      </w:r>
+      <w:r>
+        <w:rPr>
+          <w:rFonts w:ascii="Times New Roman" w:hAnsi="Times New Roman" w:cs="Times New Roman"/>
+          <w:lang w:val="it-IT"/>
+        </w:rPr>
+        <w:t>v</w:t>
+      </w:r>
+      <w:r>
+        <w:rPr>
+          <w:rFonts w:ascii="Times New Roman" w:hAnsi="Times New Roman" w:cs="Times New Roman"/>
+          <w:lang w:val="it-IT"/>
+        </w:rPr>
+        <w:t>) Hydrogen</w:t>
+      </w:r>
+    </w:p>
+    <w:p>
+      <w:pPr>
+        <w:pStyle w:val="Default"/>
+        <w:suppressAutoHyphens/>
+        <w:spacing w:before="0" w:line="240" w:lineRule="auto"/>
+        <w:rPr>
+          <w:rFonts w:ascii="Times New Roman" w:eastAsia="Times New Roman" w:hAnsi="Times New Roman" w:cs="Times New Roman"/>
+        </w:rPr>
+      </w:pPr>
+      <w:r>
+        <w:rPr>
+          <w:rFonts w:ascii="Times New Roman" w:hAnsi="Times New Roman" w:cs="Times New Roman"/>
+          <w:b/>
+          <w:bCs/>
+        </w:rPr>
+        <w:t>d</w:t>
+      </w:r>
+      <w:r>
+        <w:rPr>
+          <w:rFonts w:ascii="Times New Roman" w:hAnsi="Times New Roman" w:cs="Times New Roman"/>
+          <w:b/>
+          <w:bCs/>
+        </w:rPr>
+        <w:t>. Which of the following is a natural source of light?</w:t>
+      </w:r>
+    </w:p>
+    <w:p>
+      <w:pPr>
+        <w:pStyle w:val="Default"/>
+        <w:suppressAutoHyphens/>
+        <w:spacing w:before="0" w:line="240" w:lineRule="auto"/>
+        <w:rPr>
+          <w:rFonts w:ascii="Times New Roman" w:eastAsia="Times New Roman" w:hAnsi="Times New Roman" w:cs="Times New Roman"/>
+        </w:rPr>
+      </w:pPr>
+      <w:r>
+        <w:rPr>
+          <w:rFonts w:ascii="Times New Roman" w:hAnsi="Times New Roman" w:cs="Times New Roman"/>
+        </w:rPr>
+        <w:t>i</w:t>
+      </w:r>
+      <w:r>
+        <w:rPr>
+          <w:rFonts w:ascii="Times New Roman" w:hAnsi="Times New Roman" w:cs="Times New Roman"/>
+        </w:rPr>
+        <w:t>) The Sun</w:t>
+      </w:r>
+      <w:r>
+        <w:rPr>
+          <w:rFonts w:ascii="Times New Roman" w:hAnsi="Times New Roman" w:cs="Times New Roman"/>
+        </w:rPr>
+        <w:tab/>
+      </w:r>
+      <w:r>
+        <w:rPr>
+          <w:rFonts w:ascii="Times New Roman" w:hAnsi="Times New Roman" w:cs="Times New Roman"/>
+        </w:rPr>
+        <w:tab/>
+      </w:r>
+      <w:r>
+        <w:rPr>
+          <w:rFonts w:ascii="Times New Roman" w:hAnsi="Times New Roman" w:cs="Times New Roman"/>
+        </w:rPr>
+        <w:tab/>
+      </w:r>
+      <w:r>
+        <w:rPr>
+          <w:rFonts w:ascii="Times New Roman" w:hAnsi="Times New Roman" w:cs="Times New Roman"/>
+        </w:rPr>
+        <w:t>i</w:t>
+      </w:r>
+      <w:r>
+        <w:rPr>
+          <w:rFonts w:ascii="Times New Roman" w:hAnsi="Times New Roman" w:cs="Times New Roman"/>
+        </w:rPr>
+        <w:t>) Tube light</w:t>
+      </w:r>
+    </w:p>
+    <w:p>
+      <w:pPr>
+        <w:pStyle w:val="Default"/>
+        <w:suppressAutoHyphens/>
+        <w:spacing w:before="0" w:line="240" w:lineRule="auto"/>
+        <w:rPr>
+          <w:rFonts w:ascii="Times New Roman" w:eastAsia="Times New Roman" w:hAnsi="Times New Roman" w:cs="Times New Roman"/>
+        </w:rPr>
+      </w:pPr>
+      <w:r>
+        <w:rPr>
+          <w:rFonts w:ascii="Times New Roman" w:hAnsi="Times New Roman" w:cs="Times New Roman"/>
+        </w:rPr>
+        <w:t>iii</w:t>
+      </w:r>
+      <w:r>
+        <w:rPr>
+          <w:rFonts w:ascii="Times New Roman" w:hAnsi="Times New Roman" w:cs="Times New Roman"/>
+        </w:rPr>
+        <w:t>) Candle</w:t>
+      </w:r>
+      <w:r>
+        <w:rPr>
+          <w:rFonts w:ascii="Times New Roman" w:hAnsi="Times New Roman" w:cs="Times New Roman"/>
+        </w:rPr>
+        <w:tab/>
+      </w:r>
+      <w:r>
+        <w:rPr>
+          <w:rFonts w:ascii="Times New Roman" w:hAnsi="Times New Roman" w:cs="Times New Roman"/>
+        </w:rPr>
+        <w:tab/>
+      </w:r>
+      <w:r>
+        <w:rPr>
+          <w:rFonts w:ascii="Times New Roman" w:hAnsi="Times New Roman" w:cs="Times New Roman"/>
+        </w:rPr>
+        <w:tab/>
+      </w:r>
+      <w:r>
+        <w:rPr>
+          <w:rFonts w:ascii="Times New Roman" w:hAnsi="Times New Roman" w:cs="Times New Roman"/>
+        </w:rPr>
+        <w:t>iv</w:t>
+      </w:r>
+      <w:r>
+        <w:rPr>
+          <w:rFonts w:ascii="Times New Roman" w:hAnsi="Times New Roman" w:cs="Times New Roman"/>
+        </w:rPr>
+        <w:t>) Bulb</w:t>
+      </w:r>
+    </w:p>
+    <w:p>
+      <w:pPr>
+        <w:pStyle w:val="Default"/>
+        <w:suppressAutoHyphens/>
+        <w:spacing w:before="0" w:line="240" w:lineRule="auto"/>
+        <w:rPr>
+          <w:rFonts w:ascii="Times New Roman" w:eastAsia="Times New Roman" w:hAnsi="Times New Roman" w:cs="Times New Roman"/>
+        </w:rPr>
+      </w:pPr>
+      <w:r>
+        <w:rPr>
+          <w:rFonts w:ascii="Times New Roman" w:hAnsi="Times New Roman" w:cs="Times New Roman"/>
+          <w:b/>
+          <w:bCs/>
+        </w:rPr>
+        <w:t>e</w:t>
+      </w:r>
+      <w:r>
+        <w:rPr>
+          <w:rFonts w:ascii="Times New Roman" w:hAnsi="Times New Roman" w:cs="Times New Roman"/>
+          <w:b/>
+          <w:bCs/>
+        </w:rPr>
+        <w:t>. Which of the following is a renewable source of energy?</w:t>
+      </w:r>
+    </w:p>
+    <w:p>
+      <w:pPr>
+        <w:pStyle w:val="Default"/>
+        <w:suppressAutoHyphens/>
+        <w:spacing w:before="0" w:line="240" w:lineRule="auto"/>
+        <w:rPr>
+          <w:rFonts w:ascii="Times New Roman" w:eastAsia="Times New Roman" w:hAnsi="Times New Roman" w:cs="Times New Roman"/>
+        </w:rPr>
+      </w:pPr>
+      <w:r>
+        <w:rPr>
+          <w:rFonts w:ascii="Times New Roman" w:hAnsi="Times New Roman" w:cs="Times New Roman"/>
+        </w:rPr>
+        <w:t>i</w:t>
+      </w:r>
+      <w:r>
+        <w:rPr>
+          <w:rFonts w:ascii="Times New Roman" w:hAnsi="Times New Roman" w:cs="Times New Roman"/>
+        </w:rPr>
+        <w:t>) Solar energy</w:t>
+      </w:r>
+      <w:r>
+        <w:rPr>
+          <w:rFonts w:ascii="Times New Roman" w:hAnsi="Times New Roman" w:cs="Times New Roman"/>
+        </w:rPr>
+        <w:tab/>
+      </w:r>
+      <w:r>
+        <w:rPr>
+          <w:rFonts w:ascii="Times New Roman" w:hAnsi="Times New Roman" w:cs="Times New Roman"/>
+        </w:rPr>
+        <w:tab/>
+      </w:r>
+      <w:r>
+        <w:rPr>
+          <w:rFonts w:ascii="Times New Roman" w:hAnsi="Times New Roman" w:cs="Times New Roman"/>
+        </w:rPr>
+        <w:tab/>
+        <w:t>iv</w:t>
+      </w:r>
+      <w:r>
+        <w:rPr>
+          <w:rFonts w:ascii="Times New Roman" w:hAnsi="Times New Roman" w:cs="Times New Roman"/>
+        </w:rPr>
+        <w:t>) Coal</w:t>
+      </w:r>
+    </w:p>
+    <w:p>
+      <w:pPr>
+        <w:pStyle w:val="Default"/>
+        <w:suppressAutoHyphens/>
+        <w:spacing w:before="0" w:line="240" w:lineRule="auto"/>
+        <w:rPr>
+          <w:rFonts w:ascii="Times New Roman" w:eastAsia="Times New Roman" w:hAnsi="Times New Roman" w:cs="Times New Roman"/>
+        </w:rPr>
+      </w:pPr>
+      <w:r>
+        <w:rPr>
+          <w:rFonts w:ascii="Times New Roman" w:hAnsi="Times New Roman" w:cs="Times New Roman"/>
+        </w:rPr>
+        <w:t>iii</w:t>
+      </w:r>
+      <w:r>
+        <w:rPr>
+          <w:rFonts w:ascii="Times New Roman" w:hAnsi="Times New Roman" w:cs="Times New Roman"/>
+        </w:rPr>
+        <w:t>) Kerosene</w:t>
+      </w:r>
+      <w:r>
+        <w:rPr>
+          <w:rFonts w:ascii="Times New Roman" w:hAnsi="Times New Roman" w:cs="Times New Roman"/>
+        </w:rPr>
+        <w:tab/>
+      </w:r>
+      <w:r>
+        <w:rPr>
+          <w:rFonts w:ascii="Times New Roman" w:hAnsi="Times New Roman" w:cs="Times New Roman"/>
+        </w:rPr>
+        <w:tab/>
+      </w:r>
+      <w:r>
+        <w:rPr>
+          <w:rFonts w:ascii="Times New Roman" w:hAnsi="Times New Roman" w:cs="Times New Roman"/>
+        </w:rPr>
+        <w:tab/>
+      </w:r>
+      <w:r>
+        <w:rPr>
+          <w:rFonts w:ascii="Times New Roman" w:hAnsi="Times New Roman" w:cs="Times New Roman"/>
+        </w:rPr>
+        <w:t>v</w:t>
+      </w:r>
+      <w:r>
+        <w:rPr>
+          <w:rFonts w:ascii="Times New Roman" w:hAnsi="Times New Roman" w:cs="Times New Roman"/>
+        </w:rPr>
+        <w:t>) Petrol</w:t>
+      </w:r>
+    </w:p>
+    <w:p>
+      <w:pPr>
+        <w:pStyle w:val="Default"/>
+        <w:suppressAutoHyphens/>
+        <w:spacing w:before="0" w:line="240" w:lineRule="auto"/>
+        <w:rPr>
+          <w:rFonts w:ascii="Times New Roman" w:eastAsia="Times New Roman" w:hAnsi="Times New Roman" w:cs="Times New Roman"/>
+        </w:rPr>
+      </w:pPr>
+      <w:r>
+        <w:rPr>
+          <w:rFonts w:ascii="Times New Roman" w:hAnsi="Times New Roman" w:cs="Times New Roman"/>
+          <w:b/>
+          <w:bCs/>
+        </w:rPr>
+        <w:t>f</w:t>
+      </w:r>
+      <w:r>
+        <w:rPr>
+          <w:rFonts w:ascii="Times New Roman" w:hAnsi="Times New Roman" w:cs="Times New Roman"/>
+          <w:b/>
+          <w:bCs/>
+        </w:rPr>
+        <w:t>. Which energy is required for the process of photosynthesis?</w:t>
+      </w:r>
+    </w:p>
+    <w:p>
+      <w:pPr>
+        <w:pStyle w:val="Default"/>
+        <w:suppressAutoHyphens/>
+        <w:spacing w:before="0" w:line="240" w:lineRule="auto"/>
+        <w:rPr>
+          <w:rFonts w:ascii="Times New Roman" w:eastAsia="Times New Roman" w:hAnsi="Times New Roman" w:cs="Times New Roman"/>
+        </w:rPr>
+      </w:pPr>
+      <w:r>
+        <w:rPr>
+          <w:rFonts w:ascii="Times New Roman" w:hAnsi="Times New Roman" w:cs="Times New Roman"/>
+        </w:rPr>
+        <w:t>i</w:t>
+      </w:r>
+      <w:r>
+        <w:rPr>
+          <w:rFonts w:ascii="Times New Roman" w:hAnsi="Times New Roman" w:cs="Times New Roman"/>
+        </w:rPr>
+        <w:t>) Sound energy</w:t>
+      </w:r>
+      <w:r>
+        <w:rPr>
+          <w:rFonts w:ascii="Times New Roman" w:hAnsi="Times New Roman" w:cs="Times New Roman"/>
+        </w:rPr>
+        <w:tab/>
+      </w:r>
+      <w:r>
+        <w:rPr>
+          <w:rFonts w:ascii="Times New Roman" w:hAnsi="Times New Roman" w:cs="Times New Roman"/>
+        </w:rPr>
+        <w:tab/>
+      </w:r>
+      <w:r>
+        <w:rPr>
+          <w:rFonts w:ascii="Times New Roman" w:hAnsi="Times New Roman" w:cs="Times New Roman"/>
+        </w:rPr>
+        <w:tab/>
+        <w:t>iv</w:t>
+      </w:r>
+      <w:r>
+        <w:rPr>
+          <w:rFonts w:ascii="Times New Roman" w:hAnsi="Times New Roman" w:cs="Times New Roman"/>
+        </w:rPr>
+        <w:t>) Light energy</w:t>
+      </w:r>
+    </w:p>
+    <w:p>
+      <w:pPr>
+        <w:pStyle w:val="Default"/>
+        <w:suppressAutoHyphens/>
+        <w:spacing w:before="0" w:line="240" w:lineRule="auto"/>
+        <w:rPr>
+          <w:rFonts w:ascii="Times New Roman" w:eastAsia="Times New Roman" w:hAnsi="Times New Roman" w:cs="Times New Roman"/>
+        </w:rPr>
+      </w:pPr>
+      <w:r>
+        <w:rPr>
+          <w:rFonts w:ascii="Times New Roman" w:hAnsi="Times New Roman" w:cs="Times New Roman"/>
+        </w:rPr>
+        <w:t>iii</w:t>
+      </w:r>
+      <w:r>
+        <w:rPr>
+          <w:rFonts w:ascii="Times New Roman" w:hAnsi="Times New Roman" w:cs="Times New Roman"/>
+        </w:rPr>
+        <w:t>) Heat energy</w:t>
+      </w:r>
+      <w:r>
+        <w:rPr>
+          <w:rFonts w:ascii="Times New Roman" w:hAnsi="Times New Roman" w:cs="Times New Roman"/>
+        </w:rPr>
+        <w:tab/>
+      </w:r>
+      <w:r>
+        <w:rPr>
+          <w:rFonts w:ascii="Times New Roman" w:hAnsi="Times New Roman" w:cs="Times New Roman"/>
+        </w:rPr>
+        <w:tab/>
+      </w:r>
+      <w:r>
+        <w:rPr>
+          <w:rFonts w:ascii="Times New Roman" w:hAnsi="Times New Roman" w:cs="Times New Roman"/>
+        </w:rPr>
+        <w:tab/>
+      </w:r>
+      <w:r>
+        <w:rPr>
+          <w:rFonts w:ascii="Times New Roman" w:hAnsi="Times New Roman" w:cs="Times New Roman"/>
+        </w:rPr>
+        <w:t>v</w:t>
+      </w:r>
+      <w:r>
+        <w:rPr>
+          <w:rFonts w:ascii="Times New Roman" w:hAnsi="Times New Roman" w:cs="Times New Roman"/>
+        </w:rPr>
+        <w:t>) Magnetic energy</w:t>
+      </w:r>
+    </w:p>
+    <w:p>
+      <w:pPr>
+        <w:pStyle w:val="Default"/>
+        <w:suppressAutoHyphens/>
+        <w:spacing w:before="0" w:line="240" w:lineRule="auto"/>
+        <w:rPr>
+          <w:rFonts w:ascii="Times New Roman" w:eastAsia="Times New Roman" w:hAnsi="Times New Roman" w:cs="Times New Roman"/>
+        </w:rPr>
+      </w:pPr>
+      <w:r>
+        <w:rPr>
+          <w:rFonts w:ascii="Times New Roman" w:hAnsi="Times New Roman" w:cs="Times New Roman"/>
+          <w:b/>
+          <w:bCs/>
+        </w:rPr>
+        <w:t>g</w:t>
+      </w:r>
+      <w:r>
+        <w:rPr>
+          <w:rFonts w:ascii="Times New Roman" w:hAnsi="Times New Roman" w:cs="Times New Roman"/>
+          <w:b/>
+          <w:bCs/>
+        </w:rPr>
+        <w:t>. In which part of the human body is food absorbed?</w:t>
+      </w:r>
+    </w:p>
+    <w:p>
+      <w:pPr>
+        <w:pStyle w:val="Default"/>
+        <w:suppressAutoHyphens/>
+        <w:spacing w:before="0" w:line="240" w:lineRule="auto"/>
+        <w:rPr>
+          <w:rFonts w:ascii="Times New Roman" w:eastAsia="Times New Roman" w:hAnsi="Times New Roman" w:cs="Times New Roman"/>
+        </w:rPr>
+      </w:pPr>
+      <w:r>
+        <w:rPr>
+          <w:rFonts w:ascii="Times New Roman" w:hAnsi="Times New Roman" w:cs="Times New Roman"/>
+        </w:rPr>
+        <w:t>i</w:t>
+      </w:r>
+      <w:r>
+        <w:rPr>
+          <w:rFonts w:ascii="Times New Roman" w:hAnsi="Times New Roman" w:cs="Times New Roman"/>
+        </w:rPr>
+        <w:t>) Small intestine</w:t>
+      </w:r>
+      <w:r>
+        <w:rPr>
+          <w:rFonts w:ascii="Times New Roman" w:hAnsi="Times New Roman" w:cs="Times New Roman"/>
+        </w:rPr>
+        <w:tab/>
+      </w:r>
+      <w:r>
+        <w:rPr>
+          <w:rFonts w:ascii="Times New Roman" w:hAnsi="Times New Roman" w:cs="Times New Roman"/>
+        </w:rPr>
+        <w:tab/>
+      </w:r>
       <w:r>
         <w:rPr>
           <w:rFonts w:ascii="Times New Roman" w:hAnsi="Times New Roman" w:cs="Times New Roman"/>
           <w:lang w:val="es-ES_tradnl"/>
         </w:rPr>
-        <w:t xml:space="preserve">b) </w:t>
-      </w:r>
-      <w:proofErr w:type="spellStart"/>
+        <w:t>ii</w:t>
+      </w:r>
       <w:r>
         <w:rPr>
           <w:rFonts w:ascii="Times New Roman" w:hAnsi="Times New Roman" w:cs="Times New Roman"/>
           <w:lang w:val="es-ES_tradnl"/>
         </w:rPr>
-        <w:t>Large</w:t>
-      </w:r>
-      <w:proofErr w:type="spellEnd"/>
+        <w:t>) Large intestine</w:t>
+      </w:r>
+    </w:p>
+    <w:p>
+      <w:pPr>
+        <w:pStyle w:val="Default"/>
+        <w:suppressAutoHyphens/>
+        <w:spacing w:before="0" w:line="240" w:lineRule="auto"/>
+        <w:rPr>
+          <w:rFonts w:ascii="Times New Roman" w:eastAsia="Times New Roman" w:hAnsi="Times New Roman" w:cs="Times New Roman"/>
+        </w:rPr>
+      </w:pPr>
+      <w:r>
+        <w:rPr>
+          <w:rFonts w:ascii="Times New Roman" w:hAnsi="Times New Roman" w:cs="Times New Roman"/>
+        </w:rPr>
+        <w:t>iii</w:t>
+      </w:r>
+      <w:r>
+        <w:rPr>
+          <w:rFonts w:ascii="Times New Roman" w:hAnsi="Times New Roman" w:cs="Times New Roman"/>
+        </w:rPr>
+        <w:t>) Liver</w:t>
+      </w:r>
+      <w:r>
+        <w:rPr>
+          <w:rFonts w:ascii="Times New Roman" w:hAnsi="Times New Roman" w:cs="Times New Roman"/>
+        </w:rPr>
+        <w:tab/>
+      </w:r>
+      <w:r>
+        <w:rPr>
+          <w:rFonts w:ascii="Times New Roman" w:hAnsi="Times New Roman" w:cs="Times New Roman"/>
+        </w:rPr>
+        <w:tab/>
+      </w:r>
+      <w:r>
+        <w:rPr>
+          <w:rFonts w:ascii="Times New Roman" w:hAnsi="Times New Roman" w:cs="Times New Roman"/>
+        </w:rPr>
+        <w:tab/>
+      </w:r>
+      <w:r>
+        <w:rPr>
+          <w:rFonts w:ascii="Times New Roman" w:hAnsi="Times New Roman" w:cs="Times New Roman"/>
+        </w:rPr>
+        <w:t>iv</w:t>
+      </w:r>
+      <w:r>
+        <w:rPr>
+          <w:rFonts w:ascii="Times New Roman" w:hAnsi="Times New Roman" w:cs="Times New Roman"/>
+        </w:rPr>
+        <w:t>) Anus</w:t>
+      </w:r>
+    </w:p>
+    <w:p>
+      <w:pPr>
+        <w:pStyle w:val="Default"/>
+        <w:suppressAutoHyphens/>
+        <w:spacing w:before="0" w:line="240" w:lineRule="auto"/>
+        <w:rPr>
+          <w:rFonts w:ascii="Times New Roman" w:eastAsia="Times New Roman" w:hAnsi="Times New Roman" w:cs="Times New Roman"/>
+        </w:rPr>
+      </w:pPr>
+      <w:r>
+        <w:rPr>
+          <w:rFonts w:ascii="Times New Roman" w:hAnsi="Times New Roman" w:cs="Times New Roman"/>
+          <w:b/>
+          <w:bCs/>
+        </w:rPr>
+        <w:t>h</w:t>
+      </w:r>
+      <w:r>
+        <w:rPr>
+          <w:rFonts w:ascii="Times New Roman" w:hAnsi="Times New Roman" w:cs="Times New Roman"/>
+          <w:b/>
+          <w:bCs/>
+        </w:rPr>
+        <w:t>. Which of the following is a property of gases?</w:t>
+      </w:r>
+    </w:p>
+    <w:p>
+      <w:pPr>
+        <w:pStyle w:val="Default"/>
+        <w:suppressAutoHyphens/>
+        <w:spacing w:before="0" w:line="240" w:lineRule="auto"/>
+        <w:rPr>
+          <w:rFonts w:ascii="Times New Roman" w:eastAsia="Times New Roman" w:hAnsi="Times New Roman" w:cs="Times New Roman"/>
+        </w:rPr>
+      </w:pPr>
+      <w:r>
+        <w:rPr>
+          <w:rFonts w:ascii="Times New Roman" w:hAnsi="Times New Roman" w:cs="Times New Roman"/>
+        </w:rPr>
+        <w:t>i</w:t>
+      </w:r>
+      <w:r>
+        <w:rPr>
+          <w:rFonts w:ascii="Times New Roman" w:hAnsi="Times New Roman" w:cs="Times New Roman"/>
+        </w:rPr>
+        <w:t>) It has fixed volume</w:t>
+      </w:r>
+      <w:r>
+        <w:rPr>
+          <w:rFonts w:ascii="Times New Roman" w:hAnsi="Times New Roman" w:cs="Times New Roman"/>
+        </w:rPr>
+        <w:tab/>
+      </w:r>
+      <w:r>
+        <w:rPr>
+          <w:rFonts w:ascii="Times New Roman" w:hAnsi="Times New Roman" w:cs="Times New Roman"/>
+        </w:rPr>
+        <w:tab/>
+      </w:r>
+      <w:r>
+        <w:rPr>
+          <w:rFonts w:ascii="Times New Roman" w:hAnsi="Times New Roman" w:cs="Times New Roman"/>
+        </w:rPr>
+        <w:t>ii</w:t>
+      </w:r>
+      <w:r>
+        <w:rPr>
+          <w:rFonts w:ascii="Times New Roman" w:hAnsi="Times New Roman" w:cs="Times New Roman"/>
+        </w:rPr>
+        <w:t>) It has fixed shape</w:t>
+      </w:r>
+    </w:p>
+    <w:p>
+      <w:pPr>
+        <w:pStyle w:val="Default"/>
+        <w:suppressAutoHyphens/>
+        <w:spacing w:before="0" w:line="240" w:lineRule="auto"/>
+        <w:rPr>
+          <w:rFonts w:ascii="Times New Roman" w:eastAsia="Times New Roman" w:hAnsi="Times New Roman" w:cs="Times New Roman"/>
+        </w:rPr>
+      </w:pPr>
+      <w:r>
+        <w:rPr>
+          <w:rFonts w:ascii="Times New Roman" w:hAnsi="Times New Roman" w:cs="Times New Roman"/>
+        </w:rPr>
+        <w:t>iii</w:t>
+      </w:r>
+      <w:r>
+        <w:rPr>
+          <w:rFonts w:ascii="Times New Roman" w:hAnsi="Times New Roman" w:cs="Times New Roman"/>
+        </w:rPr>
+        <w:t>) It has fixed mass</w:t>
+      </w:r>
+      <w:r>
+        <w:rPr>
+          <w:rFonts w:ascii="Times New Roman" w:hAnsi="Times New Roman" w:cs="Times New Roman"/>
+        </w:rPr>
+        <w:tab/>
+      </w:r>
+      <w:r>
+        <w:rPr>
+          <w:rFonts w:ascii="Times New Roman" w:hAnsi="Times New Roman" w:cs="Times New Roman"/>
+        </w:rPr>
+        <w:tab/>
+      </w:r>
+      <w:r>
+        <w:rPr>
+          <w:rFonts w:ascii="Times New Roman" w:hAnsi="Times New Roman" w:cs="Times New Roman"/>
+        </w:rPr>
+        <w:t>iv</w:t>
+      </w:r>
+      <w:r>
+        <w:rPr>
+          <w:rFonts w:ascii="Times New Roman" w:hAnsi="Times New Roman" w:cs="Times New Roman"/>
+        </w:rPr>
+        <w:t>) None of the above</w:t>
+      </w:r>
+    </w:p>
+    <w:p>
+      <w:pPr>
+        <w:pStyle w:val="Default"/>
+        <w:suppressAutoHyphens/>
+        <w:spacing w:before="0" w:line="240" w:lineRule="auto"/>
+        <w:rPr>
+          <w:rFonts w:ascii="Times New Roman" w:eastAsia="Times New Roman" w:hAnsi="Times New Roman" w:cs="Times New Roman"/>
+        </w:rPr>
+      </w:pPr>
+      <w:r>
+        <w:rPr>
+          <w:rFonts w:ascii="Times New Roman" w:hAnsi="Times New Roman" w:cs="Times New Roman"/>
+          <w:b/>
+          <w:bCs/>
+        </w:rPr>
+        <w:t>i</w:t>
+      </w:r>
+      <w:r>
+        <w:rPr>
+          <w:rFonts w:ascii="Times New Roman" w:hAnsi="Times New Roman" w:cs="Times New Roman"/>
+          <w:b/>
+          <w:bCs/>
+        </w:rPr>
+        <w:t>. Which part of the human body collects urine?</w:t>
+      </w:r>
+    </w:p>
+    <w:p>
+      <w:pPr>
+        <w:pStyle w:val="Default"/>
+        <w:suppressAutoHyphens/>
+        <w:spacing w:before="0" w:line="240" w:lineRule="auto"/>
+        <w:rPr>
+          <w:rFonts w:ascii="Times New Roman" w:eastAsia="Times New Roman" w:hAnsi="Times New Roman" w:cs="Times New Roman"/>
+        </w:rPr>
+      </w:pPr>
+      <w:r>
+        <w:rPr>
+          <w:rFonts w:ascii="Times New Roman" w:hAnsi="Times New Roman" w:cs="Times New Roman"/>
+        </w:rPr>
+        <w:t>i</w:t>
+      </w:r>
+      <w:r>
+        <w:rPr>
+          <w:rFonts w:ascii="Times New Roman" w:hAnsi="Times New Roman" w:cs="Times New Roman"/>
+        </w:rPr>
+        <w:t>) Small intestine</w:t>
+      </w:r>
+      <w:r>
+        <w:rPr>
+          <w:rFonts w:ascii="Times New Roman" w:hAnsi="Times New Roman" w:cs="Times New Roman"/>
+        </w:rPr>
+        <w:tab/>
+      </w:r>
+      <w:r>
+        <w:rPr>
+          <w:rFonts w:ascii="Times New Roman" w:hAnsi="Times New Roman" w:cs="Times New Roman"/>
+        </w:rPr>
+        <w:tab/>
+      </w:r>
       <w:r>
         <w:rPr>
           <w:rFonts w:ascii="Times New Roman" w:hAnsi="Times New Roman" w:cs="Times New Roman"/>
           <w:lang w:val="es-ES_tradnl"/>
         </w:rPr>
-        <w:t xml:space="preserve"> intestine</w:t>
-      </w:r>
-    </w:p>
-    <w:p>
-      <w:pPr>
-        <w:pStyle w:val="Default"/>
-        <w:suppressAutoHyphens/>
-        <w:spacing w:before="0" w:line="240" w:lineRule="auto"/>
-        <w:rPr>
-          <w:rFonts w:ascii="Times New Roman" w:eastAsia="Times New Roman" w:hAnsi="Times New Roman" w:cs="Times New Roman"/>
-        </w:rPr>
-      </w:pPr>
-      <w:r>
-        <w:rPr>
-          <w:rFonts w:ascii="Times New Roman" w:hAnsi="Times New Roman" w:cs="Times New Roman"/>
-        </w:rPr>
-        <w:t>c) Liver</w:t>
-      </w:r>
-    </w:p>
-    <w:p>
-      <w:pPr>
-        <w:pStyle w:val="Default"/>
-        <w:suppressAutoHyphens/>
-        <w:spacing w:before="0" w:line="240" w:lineRule="auto"/>
-        <w:rPr>
-          <w:rFonts w:ascii="Times New Roman" w:eastAsia="Times New Roman" w:hAnsi="Times New Roman" w:cs="Times New Roman"/>
-        </w:rPr>
-      </w:pPr>
-      <w:r>
-        <w:rPr>
-          <w:rFonts w:ascii="Times New Roman" w:hAnsi="Times New Roman" w:cs="Times New Roman"/>
-        </w:rPr>
-        <w:t>d) Anus</w:t>
-      </w:r>
-    </w:p>
-    <w:p>
-      <w:pPr>
-        <w:pStyle w:val="Default"/>
-        <w:suppressAutoHyphens/>
-        <w:spacing w:before="0" w:line="240" w:lineRule="auto"/>
-        <w:rPr>
-          <w:rFonts w:ascii="Times New Roman" w:eastAsia="Times New Roman" w:hAnsi="Times New Roman" w:cs="Times New Roman"/>
-        </w:rPr>
-      </w:pPr>
-      <w:r>
-        <w:rPr>
-          <w:rFonts w:ascii="Times New Roman" w:hAnsi="Times New Roman" w:cs="Times New Roman"/>
-          <w:b/>
-          <w:bCs/>
-        </w:rPr>
-        <w:t>8. Which of the following is a property of gases?</w:t>
-      </w:r>
-    </w:p>
-    <w:p>
-      <w:pPr>
-        <w:pStyle w:val="Default"/>
-        <w:suppressAutoHyphens/>
-        <w:spacing w:before="0" w:line="240" w:lineRule="auto"/>
-        <w:rPr>
-          <w:rFonts w:ascii="Times New Roman" w:eastAsia="Times New Roman" w:hAnsi="Times New Roman" w:cs="Times New Roman"/>
-        </w:rPr>
-      </w:pPr>
-      <w:r>
-        <w:rPr>
-          <w:rFonts w:ascii="Times New Roman" w:hAnsi="Times New Roman" w:cs="Times New Roman"/>
-        </w:rPr>
-        <w:t>a) It has fixed volume</w:t>
-      </w:r>
-    </w:p>
-    <w:p>
-      <w:pPr>
-        <w:pStyle w:val="Default"/>
-        <w:suppressAutoHyphens/>
-        <w:spacing w:before="0" w:line="240" w:lineRule="auto"/>
-        <w:rPr>
-          <w:rFonts w:ascii="Times New Roman" w:eastAsia="Times New Roman" w:hAnsi="Times New Roman" w:cs="Times New Roman"/>
-        </w:rPr>
-      </w:pPr>
-      <w:r>
-        <w:rPr>
-          <w:rFonts w:ascii="Times New Roman" w:hAnsi="Times New Roman" w:cs="Times New Roman"/>
-        </w:rPr>
-        <w:t>b) It has fixed shape</w:t>
-      </w:r>
-    </w:p>
-    <w:p>
-      <w:pPr>
-        <w:pStyle w:val="Default"/>
-        <w:suppressAutoHyphens/>
-        <w:spacing w:before="0" w:line="240" w:lineRule="auto"/>
-        <w:rPr>
-          <w:rFonts w:ascii="Times New Roman" w:eastAsia="Times New Roman" w:hAnsi="Times New Roman" w:cs="Times New Roman"/>
-        </w:rPr>
-      </w:pPr>
-      <w:r>
-        <w:rPr>
-          <w:rFonts w:ascii="Times New Roman" w:hAnsi="Times New Roman" w:cs="Times New Roman"/>
-        </w:rPr>
-        <w:t>c) It has fixed mass</w:t>
-      </w:r>
-    </w:p>
-    <w:p>
-      <w:pPr>
-        <w:pStyle w:val="Default"/>
-        <w:suppressAutoHyphens/>
-        <w:spacing w:before="0" w:line="240" w:lineRule="auto"/>
-        <w:rPr>
-          <w:rFonts w:ascii="Times New Roman" w:eastAsia="Times New Roman" w:hAnsi="Times New Roman" w:cs="Times New Roman"/>
-        </w:rPr>
-      </w:pPr>
-      <w:r>
-        <w:rPr>
-          <w:rFonts w:ascii="Times New Roman" w:hAnsi="Times New Roman" w:cs="Times New Roman"/>
-        </w:rPr>
-        <w:t>d) None of the above</w:t>
-      </w:r>
-    </w:p>
-    <w:p>
-      <w:pPr>
-        <w:pStyle w:val="Default"/>
-        <w:suppressAutoHyphens/>
-        <w:spacing w:before="0" w:line="240" w:lineRule="auto"/>
-        <w:rPr>
-          <w:rFonts w:ascii="Times New Roman" w:eastAsia="Times New Roman" w:hAnsi="Times New Roman" w:cs="Times New Roman"/>
-        </w:rPr>
-      </w:pPr>
-      <w:r>
-        <w:rPr>
-          <w:rFonts w:ascii="Times New Roman" w:hAnsi="Times New Roman" w:cs="Times New Roman"/>
-          <w:b/>
-          <w:bCs/>
-        </w:rPr>
-        <w:t>9. Which part of the human body collects urine?</w:t>
-      </w:r>
-    </w:p>
-    <w:p>
-      <w:pPr>
-        <w:pStyle w:val="Default"/>
-        <w:suppressAutoHyphens/>
-        <w:spacing w:before="0" w:line="240" w:lineRule="auto"/>
-        <w:rPr>
-          <w:rFonts w:ascii="Times New Roman" w:eastAsia="Times New Roman" w:hAnsi="Times New Roman" w:cs="Times New Roman"/>
-        </w:rPr>
-      </w:pPr>
-      <w:r>
-        <w:rPr>
-          <w:rFonts w:ascii="Times New Roman" w:hAnsi="Times New Roman" w:cs="Times New Roman"/>
-        </w:rPr>
-        <w:t xml:space="preserve">a) </w:t>
-      </w:r>
-      <w:proofErr w:type="gramStart"/>
-      <w:r>
-        <w:rPr>
-          <w:rFonts w:ascii="Times New Roman" w:hAnsi="Times New Roman" w:cs="Times New Roman"/>
-        </w:rPr>
-        <w:t>Small</w:t>
-      </w:r>
-      <w:proofErr w:type="gramEnd"/>
-      <w:r>
-        <w:rPr>
-          <w:rFonts w:ascii="Times New Roman" w:hAnsi="Times New Roman" w:cs="Times New Roman"/>
-        </w:rPr>
-        <w:t xml:space="preserve"> intestine</w:t>
-      </w:r>
-    </w:p>
-    <w:p>
-      <w:pPr>
-        <w:pStyle w:val="Default"/>
-        <w:suppressAutoHyphens/>
-        <w:spacing w:before="0" w:line="240" w:lineRule="auto"/>
-        <w:rPr>
-          <w:rFonts w:ascii="Times New Roman" w:eastAsia="Times New Roman" w:hAnsi="Times New Roman" w:cs="Times New Roman"/>
-        </w:rPr>
-      </w:pPr>
+        <w:t>ii</w:t>
+      </w:r>
       <w:r>
         <w:rPr>
           <w:rFonts w:ascii="Times New Roman" w:hAnsi="Times New Roman" w:cs="Times New Roman"/>
           <w:lang w:val="es-ES_tradnl"/>
         </w:rPr>
-        <w:t xml:space="preserve">b) </w:t>
-      </w:r>
-      <w:proofErr w:type="spellStart"/>
-      <w:r>
-        <w:rPr>
-          <w:rFonts w:ascii="Times New Roman" w:hAnsi="Times New Roman" w:cs="Times New Roman"/>
-          <w:lang w:val="es-ES_tradnl"/>
-        </w:rPr>
-        <w:t>Large</w:t>
-      </w:r>
-      <w:proofErr w:type="spellEnd"/>
-      <w:r>
-        <w:rPr>
-          <w:rFonts w:ascii="Times New Roman" w:hAnsi="Times New Roman" w:cs="Times New Roman"/>
-          <w:lang w:val="es-ES_tradnl"/>
-        </w:rPr>
-        <w:t xml:space="preserve"> intestine</w:t>
-      </w:r>
-    </w:p>
-    <w:p>
-      <w:pPr>
-        <w:pStyle w:val="Default"/>
-        <w:suppressAutoHyphens/>
-        <w:spacing w:before="0" w:line="240" w:lineRule="auto"/>
-        <w:rPr>
-          <w:rFonts w:ascii="Times New Roman" w:eastAsia="Times New Roman" w:hAnsi="Times New Roman" w:cs="Times New Roman"/>
-        </w:rPr>
-      </w:pPr>
-      <w:r>
-        <w:rPr>
-          <w:rFonts w:ascii="Times New Roman" w:hAnsi="Times New Roman" w:cs="Times New Roman"/>
-        </w:rPr>
-        <w:t>c) Kidney</w:t>
-      </w:r>
-    </w:p>
-    <w:p>
-      <w:pPr>
-        <w:pStyle w:val="Default"/>
-        <w:suppressAutoHyphens/>
-        <w:spacing w:before="0" w:line="240" w:lineRule="auto"/>
-        <w:rPr>
-          <w:rFonts w:ascii="Times New Roman" w:eastAsia="Times New Roman" w:hAnsi="Times New Roman" w:cs="Times New Roman"/>
-        </w:rPr>
-      </w:pPr>
-      <w:r>
-        <w:rPr>
-          <w:rFonts w:ascii="Times New Roman" w:hAnsi="Times New Roman" w:cs="Times New Roman"/>
-        </w:rPr>
-        <w:t>d) Urinary bladder</w:t>
-      </w:r>
-    </w:p>
-    <w:p>
-      <w:pPr>
-        <w:pStyle w:val="Default"/>
-        <w:suppressAutoHyphens/>
-        <w:spacing w:before="0" w:line="240" w:lineRule="auto"/>
-        <w:rPr>
-          <w:rFonts w:ascii="Times New Roman" w:eastAsia="Times New Roman" w:hAnsi="Times New Roman" w:cs="Times New Roman"/>
-        </w:rPr>
-      </w:pPr>
-      <w:r>
-        <w:rPr>
-          <w:rFonts w:ascii="Times New Roman" w:hAnsi="Times New Roman" w:cs="Times New Roman"/>
-          <w:b/>
-          <w:bCs/>
-        </w:rPr>
-        <w:t>10. What is the breathing organ of a plant?</w:t>
-      </w:r>
-    </w:p>
-    <w:p>
-      <w:pPr>
-        <w:pStyle w:val="Default"/>
-        <w:suppressAutoHyphens/>
-        <w:spacing w:before="0" w:line="240" w:lineRule="auto"/>
-        <w:rPr>
-          <w:rFonts w:ascii="Times New Roman" w:eastAsia="Times New Roman" w:hAnsi="Times New Roman" w:cs="Times New Roman"/>
-        </w:rPr>
-      </w:pPr>
-      <w:r>
-        <w:rPr>
-          <w:rFonts w:ascii="Times New Roman" w:hAnsi="Times New Roman" w:cs="Times New Roman"/>
-        </w:rPr>
-        <w:t>a) Stomata</w:t>
-      </w:r>
-    </w:p>
-    <w:p>
-      <w:pPr>
-        <w:pStyle w:val="Default"/>
-        <w:suppressAutoHyphens/>
-        <w:spacing w:before="0" w:line="240" w:lineRule="auto"/>
-        <w:rPr>
-          <w:rFonts w:ascii="Times New Roman" w:eastAsia="Times New Roman" w:hAnsi="Times New Roman" w:cs="Times New Roman"/>
-        </w:rPr>
-      </w:pPr>
-      <w:r>
-        <w:rPr>
-          <w:rFonts w:ascii="Times New Roman" w:hAnsi="Times New Roman" w:cs="Times New Roman"/>
-        </w:rPr>
-        <w:t>b) Lamina</w:t>
-      </w:r>
-    </w:p>
-    <w:p>
-      <w:pPr>
-        <w:pStyle w:val="Default"/>
-        <w:suppressAutoHyphens/>
-        <w:spacing w:before="0" w:line="240" w:lineRule="auto"/>
-        <w:rPr>
-          <w:rFonts w:ascii="Times New Roman" w:eastAsia="Times New Roman" w:hAnsi="Times New Roman" w:cs="Times New Roman"/>
-        </w:rPr>
-      </w:pPr>
-      <w:r>
-        <w:rPr>
-          <w:rFonts w:ascii="Times New Roman" w:hAnsi="Times New Roman" w:cs="Times New Roman"/>
-        </w:rPr>
-        <w:t>c) Flower</w:t>
-      </w:r>
-    </w:p>
-    <w:p>
-      <w:pPr>
-        <w:pStyle w:val="Default"/>
-        <w:suppressAutoHyphens/>
-        <w:spacing w:before="0" w:line="240" w:lineRule="auto"/>
-        <w:rPr>
-          <w:rFonts w:ascii="Times New Roman" w:eastAsia="Times New Roman" w:hAnsi="Times New Roman" w:cs="Times New Roman"/>
-        </w:rPr>
-      </w:pPr>
+        <w:t>) Large intestine</w:t>
+      </w:r>
+    </w:p>
+    <w:p>
+      <w:pPr>
+        <w:pStyle w:val="Default"/>
+        <w:suppressAutoHyphens/>
+        <w:spacing w:before="0" w:line="240" w:lineRule="auto"/>
+        <w:rPr>
+          <w:rFonts w:ascii="Times New Roman" w:eastAsia="Times New Roman" w:hAnsi="Times New Roman" w:cs="Times New Roman"/>
+        </w:rPr>
+      </w:pPr>
+      <w:r>
+        <w:rPr>
+          <w:rFonts w:ascii="Times New Roman" w:hAnsi="Times New Roman" w:cs="Times New Roman"/>
+        </w:rPr>
+        <w:t>iii</w:t>
+      </w:r>
+      <w:r>
+        <w:rPr>
+          <w:rFonts w:ascii="Times New Roman" w:hAnsi="Times New Roman" w:cs="Times New Roman"/>
+        </w:rPr>
+        <w:t>) Kidney</w:t>
+      </w:r>
+      <w:r>
+        <w:rPr>
+          <w:rFonts w:ascii="Times New Roman" w:hAnsi="Times New Roman" w:cs="Times New Roman"/>
+        </w:rPr>
+        <w:tab/>
+      </w:r>
+      <w:r>
+        <w:rPr>
+          <w:rFonts w:ascii="Times New Roman" w:hAnsi="Times New Roman" w:cs="Times New Roman"/>
+        </w:rPr>
+        <w:tab/>
+      </w:r>
+      <w:r>
+        <w:rPr>
+          <w:rFonts w:ascii="Times New Roman" w:hAnsi="Times New Roman" w:cs="Times New Roman"/>
+        </w:rPr>
+        <w:tab/>
+      </w:r>
+      <w:r>
+        <w:rPr>
+          <w:rFonts w:ascii="Times New Roman" w:hAnsi="Times New Roman" w:cs="Times New Roman"/>
+        </w:rPr>
+        <w:t>iv</w:t>
+      </w:r>
+      <w:r>
+        <w:rPr>
+          <w:rFonts w:ascii="Times New Roman" w:hAnsi="Times New Roman" w:cs="Times New Roman"/>
+        </w:rPr>
+        <w:t>) Urinary bladder</w:t>
+      </w:r>
+    </w:p>
+    <w:p>
+      <w:pPr>
+        <w:pStyle w:val="Default"/>
+        <w:suppressAutoHyphens/>
+        <w:spacing w:before="0" w:line="240" w:lineRule="auto"/>
+        <w:rPr>
+          <w:rFonts w:ascii="Times New Roman" w:eastAsia="Times New Roman" w:hAnsi="Times New Roman" w:cs="Times New Roman"/>
+        </w:rPr>
+      </w:pPr>
+      <w:r>
+        <w:rPr>
+          <w:rFonts w:ascii="Times New Roman" w:hAnsi="Times New Roman" w:cs="Times New Roman"/>
+          <w:b/>
+          <w:bCs/>
+        </w:rPr>
+        <w:t>j</w:t>
+      </w:r>
+      <w:r>
+        <w:rPr>
+          <w:rFonts w:ascii="Times New Roman" w:hAnsi="Times New Roman" w:cs="Times New Roman"/>
+          <w:b/>
+          <w:bCs/>
+        </w:rPr>
+        <w:t>. What is the breathing organ of a plant?</w:t>
+      </w:r>
+    </w:p>
+    <w:p>
+      <w:pPr>
+        <w:pStyle w:val="Default"/>
+        <w:suppressAutoHyphens/>
+        <w:spacing w:before="0" w:line="240" w:lineRule="auto"/>
+        <w:rPr>
+          <w:rFonts w:ascii="Times New Roman" w:eastAsia="Times New Roman" w:hAnsi="Times New Roman" w:cs="Times New Roman"/>
+        </w:rPr>
+      </w:pPr>
+      <w:r>
+        <w:rPr>
+          <w:rFonts w:ascii="Times New Roman" w:hAnsi="Times New Roman" w:cs="Times New Roman"/>
+        </w:rPr>
+        <w:t>i</w:t>
+      </w:r>
+      <w:r>
+        <w:rPr>
+          <w:rFonts w:ascii="Times New Roman" w:hAnsi="Times New Roman" w:cs="Times New Roman"/>
+        </w:rPr>
+        <w:t>) Stomata</w:t>
+      </w:r>
+      <w:r>
+        <w:rPr>
+          <w:rFonts w:ascii="Times New Roman" w:hAnsi="Times New Roman" w:cs="Times New Roman"/>
+        </w:rPr>
+        <w:tab/>
+      </w:r>
+      <w:r>
+        <w:rPr>
+          <w:rFonts w:ascii="Times New Roman" w:hAnsi="Times New Roman" w:cs="Times New Roman"/>
+        </w:rPr>
+        <w:tab/>
+      </w:r>
+      <w:r>
+        <w:rPr>
+          <w:rFonts w:ascii="Times New Roman" w:hAnsi="Times New Roman" w:cs="Times New Roman"/>
+        </w:rPr>
+        <w:tab/>
+      </w:r>
+      <w:r>
+        <w:rPr>
+          <w:rFonts w:ascii="Times New Roman" w:hAnsi="Times New Roman" w:cs="Times New Roman"/>
+        </w:rPr>
+        <w:t>ii</w:t>
+      </w:r>
+      <w:r>
+        <w:rPr>
+          <w:rFonts w:ascii="Times New Roman" w:hAnsi="Times New Roman" w:cs="Times New Roman"/>
+        </w:rPr>
+        <w:t>) Lamina</w:t>
+      </w:r>
+    </w:p>
+    <w:p>
+      <w:pPr>
+        <w:pStyle w:val="Default"/>
+        <w:suppressAutoHyphens/>
+        <w:spacing w:before="0" w:line="240" w:lineRule="auto"/>
+        <w:rPr>
+          <w:rFonts w:ascii="Times New Roman" w:eastAsia="Times New Roman" w:hAnsi="Times New Roman" w:cs="Times New Roman"/>
+        </w:rPr>
+      </w:pPr>
+      <w:r>
+        <w:rPr>
+          <w:rFonts w:ascii="Times New Roman" w:hAnsi="Times New Roman" w:cs="Times New Roman"/>
+        </w:rPr>
+        <w:t>iii</w:t>
+      </w:r>
+      <w:r>
+        <w:rPr>
+          <w:rFonts w:ascii="Times New Roman" w:hAnsi="Times New Roman" w:cs="Times New Roman"/>
+        </w:rPr>
+        <w:t>) Flower</w:t>
+      </w:r>
+      <w:r>
+        <w:rPr>
+          <w:rFonts w:ascii="Times New Roman" w:hAnsi="Times New Roman" w:cs="Times New Roman"/>
+        </w:rPr>
+        <w:tab/>
+      </w:r>
+      <w:r>
+        <w:rPr>
+          <w:rFonts w:ascii="Times New Roman" w:hAnsi="Times New Roman" w:cs="Times New Roman"/>
+        </w:rPr>
+        <w:tab/>
+      </w:r>
+      <w:r>
+        <w:rPr>
+          <w:rFonts w:ascii="Times New Roman" w:hAnsi="Times New Roman" w:cs="Times New Roman"/>
+        </w:rPr>
+        <w:tab/>
+      </w:r>
+      <w:r>
+        <w:rPr>
+          <w:rFonts w:ascii="Times New Roman" w:hAnsi="Times New Roman" w:cs="Times New Roman"/>
+        </w:rPr>
+        <w:t>iv</w:t>
+      </w:r>
       <w:r>
         <w:rPr>
           <w:rFonts w:ascii="Times New Roman" w:hAnsi="Times New Roman" w:cs="Times New Roman"/>
           <w:lang w:val="nl-NL"/>
         </w:rPr>
-        <w:t>d) Root</w:t>
+        <w:t>) Root</w:t>
       </w:r>
     </w:p>
     <w:p>
@@ -1341,7 +1700,10 @@
         <w:spacing w:before="0" w:line="240" w:lineRule="auto"/>
         <w:jc w:val="center"/>
         <w:rPr>
-          <w:rFonts w:ascii="Times New Roman" w:eastAsia="Times New Roman" w:hAnsi="Times New Roman" w:cs="Times New Roman"/>
+          <w:rFonts w:ascii="Times New Roman" w:hAnsi="Times New Roman" w:cs="Times New Roman"/>
+          <w:b/>
+          <w:bCs/>
+          <w:lang w:val="fr-FR"/>
         </w:rPr>
       </w:pPr>
       <w:r>
@@ -1352,13 +1714,38 @@
         </w:rPr>
         <w:br/>
       </w:r>
-      <w:r>
+    </w:p>
+    <w:p>
+      <w:pPr>
+        <w:pStyle w:val="Default"/>
+        <w:suppressAutoHyphens/>
+        <w:spacing w:before="0" w:line="240" w:lineRule="auto"/>
+        <w:jc w:val="center"/>
         <w:rPr>
           <w:rFonts w:ascii="Times New Roman" w:hAnsi="Times New Roman" w:cs="Times New Roman"/>
           <w:b/>
           <w:bCs/>
           <w:lang w:val="fr-FR"/>
         </w:rPr>
+      </w:pPr>
+    </w:p>
+    <w:p>
+      <w:pPr>
+        <w:pStyle w:val="Default"/>
+        <w:suppressAutoHyphens/>
+        <w:spacing w:before="0" w:line="240" w:lineRule="auto"/>
+        <w:jc w:val="center"/>
+        <w:rPr>
+          <w:rFonts w:ascii="Times New Roman" w:eastAsia="Times New Roman" w:hAnsi="Times New Roman" w:cs="Times New Roman"/>
+        </w:rPr>
+      </w:pPr>
+      <w:r>
+        <w:rPr>
+          <w:rFonts w:ascii="Times New Roman" w:hAnsi="Times New Roman" w:cs="Times New Roman"/>
+          <w:b/>
+          <w:bCs/>
+          <w:lang w:val="fr-FR"/>
+        </w:rPr>
         <w:t xml:space="preserve">Section </w:t>
       </w:r>
       <w:r>
@@ -1385,6 +1772,14 @@
           <w:b/>
           <w:bCs/>
         </w:rPr>
+        <w:t xml:space="preserve">2. </w:t>
+      </w:r>
+      <w:r>
+        <w:rPr>
+          <w:rFonts w:ascii="Times New Roman" w:hAnsi="Times New Roman" w:cs="Times New Roman"/>
+          <w:b/>
+          <w:bCs/>
+        </w:rPr>
         <w:t>Very Short Answer Questions</w:t>
       </w:r>
       <w:r>
@@ -1466,151 +1861,173 @@
         <w:rPr>
           <w:rFonts w:ascii="Times New Roman" w:hAnsi="Times New Roman" w:cs="Times New Roman"/>
         </w:rPr>
-        <w:t>1. Write any one use of a measuring cylinder.</w:t>
-      </w:r>
-    </w:p>
-    <w:p>
-      <w:pPr>
-        <w:pStyle w:val="Default"/>
-        <w:suppressAutoHyphens/>
-        <w:spacing w:before="0" w:line="240" w:lineRule="auto"/>
-        <w:rPr>
-          <w:rFonts w:ascii="Times New Roman" w:eastAsia="Times New Roman" w:hAnsi="Times New Roman" w:cs="Times New Roman"/>
-        </w:rPr>
-      </w:pPr>
-      <w:r>
-        <w:rPr>
-          <w:rFonts w:ascii="Times New Roman" w:hAnsi="Times New Roman" w:cs="Times New Roman"/>
-        </w:rPr>
-        <w:t>2. What happens when we expose Tamara (Mimosa plant) to light?</w:t>
-      </w:r>
-    </w:p>
-    <w:p>
-      <w:pPr>
-        <w:pStyle w:val="Default"/>
-        <w:suppressAutoHyphens/>
-        <w:spacing w:before="0" w:line="240" w:lineRule="auto"/>
-        <w:rPr>
-          <w:rFonts w:ascii="Times New Roman" w:eastAsia="Times New Roman" w:hAnsi="Times New Roman" w:cs="Times New Roman"/>
-        </w:rPr>
-      </w:pPr>
-      <w:r>
-        <w:rPr>
-          <w:rFonts w:ascii="Times New Roman" w:hAnsi="Times New Roman" w:cs="Times New Roman"/>
-        </w:rPr>
-        <w:t>3. Write any one effect of misuse of energy.</w:t>
-      </w:r>
-    </w:p>
-    <w:p>
-      <w:pPr>
-        <w:pStyle w:val="Default"/>
-        <w:suppressAutoHyphens/>
-        <w:spacing w:before="0" w:line="240" w:lineRule="auto"/>
-        <w:rPr>
-          <w:rFonts w:ascii="Times New Roman" w:eastAsia="Times New Roman" w:hAnsi="Times New Roman" w:cs="Times New Roman"/>
-        </w:rPr>
-      </w:pPr>
-      <w:r>
-        <w:rPr>
-          <w:rFonts w:ascii="Times New Roman" w:hAnsi="Times New Roman" w:cs="Times New Roman"/>
-        </w:rPr>
-        <w:t>4. Define energy.</w:t>
-      </w:r>
-    </w:p>
-    <w:p>
-      <w:pPr>
-        <w:pStyle w:val="Default"/>
-        <w:suppressAutoHyphens/>
-        <w:spacing w:before="0" w:line="240" w:lineRule="auto"/>
-        <w:rPr>
-          <w:rFonts w:ascii="Times New Roman" w:eastAsia="Times New Roman" w:hAnsi="Times New Roman" w:cs="Times New Roman"/>
-        </w:rPr>
-      </w:pPr>
-      <w:r>
-        <w:rPr>
-          <w:rFonts w:ascii="Times New Roman" w:hAnsi="Times New Roman" w:cs="Times New Roman"/>
-        </w:rPr>
-        <w:t>5. Write any two parts of a plant.</w:t>
-      </w:r>
-    </w:p>
-    <w:p>
-      <w:pPr>
-        <w:pStyle w:val="Default"/>
-        <w:suppressAutoHyphens/>
-        <w:spacing w:before="0" w:line="240" w:lineRule="auto"/>
-        <w:rPr>
-          <w:rFonts w:ascii="Times New Roman" w:eastAsia="Times New Roman" w:hAnsi="Times New Roman" w:cs="Times New Roman"/>
-        </w:rPr>
-      </w:pPr>
-      <w:r>
-        <w:rPr>
-          <w:rFonts w:ascii="Times New Roman" w:hAnsi="Times New Roman" w:cs="Times New Roman"/>
-        </w:rPr>
-        <w:t>6. Write the classes of animals having the following features:</w:t>
-      </w:r>
-    </w:p>
-    <w:p>
-      <w:pPr>
-        <w:pStyle w:val="Default"/>
-        <w:suppressAutoHyphens/>
-        <w:spacing w:before="0" w:line="240" w:lineRule="auto"/>
-        <w:rPr>
-          <w:rFonts w:ascii="Times New Roman" w:eastAsia="Times New Roman" w:hAnsi="Times New Roman" w:cs="Times New Roman"/>
-        </w:rPr>
-      </w:pPr>
-      <w:r>
-        <w:rPr>
-          <w:rFonts w:ascii="Times New Roman" w:hAnsi="Times New Roman" w:cs="Times New Roman"/>
-        </w:rPr>
-        <w:t>a) Crawls on land and lays eggs</w:t>
-      </w:r>
-    </w:p>
-    <w:p>
-      <w:pPr>
-        <w:pStyle w:val="Default"/>
-        <w:suppressAutoHyphens/>
-        <w:spacing w:before="0" w:line="240" w:lineRule="auto"/>
-        <w:rPr>
-          <w:rFonts w:ascii="Times New Roman" w:eastAsia="Times New Roman" w:hAnsi="Times New Roman" w:cs="Times New Roman"/>
-        </w:rPr>
-      </w:pPr>
-      <w:r>
-        <w:rPr>
-          <w:rFonts w:ascii="Times New Roman" w:hAnsi="Times New Roman" w:cs="Times New Roman"/>
-        </w:rPr>
-        <w:t>b) Bears mammary glands and is warm-blooded</w:t>
-      </w:r>
-    </w:p>
-    <w:p>
-      <w:pPr>
-        <w:pStyle w:val="Default"/>
-        <w:suppressAutoHyphens/>
-        <w:spacing w:before="0" w:line="240" w:lineRule="auto"/>
-        <w:rPr>
-          <w:rFonts w:ascii="Times New Roman" w:eastAsia="Times New Roman" w:hAnsi="Times New Roman" w:cs="Times New Roman"/>
-        </w:rPr>
-      </w:pPr>
-      <w:r>
-        <w:rPr>
-          <w:rFonts w:ascii="Times New Roman" w:hAnsi="Times New Roman" w:cs="Times New Roman"/>
-        </w:rPr>
-        <w:t>7. What are the two main groups of animals?</w:t>
-      </w:r>
-    </w:p>
-    <w:p>
-      <w:pPr>
-        <w:pStyle w:val="Default"/>
-        <w:suppressAutoHyphens/>
-        <w:spacing w:before="0" w:line="240" w:lineRule="auto"/>
-        <w:rPr>
-          <w:rFonts w:ascii="Times New Roman" w:eastAsia="Times New Roman" w:hAnsi="Times New Roman" w:cs="Times New Roman"/>
-        </w:rPr>
-      </w:pPr>
-      <w:r>
-        <w:rPr>
-          <w:rFonts w:ascii="Times New Roman" w:hAnsi="Times New Roman" w:cs="Times New Roman"/>
-        </w:rPr>
-        <w:t>8. Which organ is involved in human excretion?</w:t>
+        <w:t>a</w:t>
+      </w:r>
+      <w:r>
+        <w:rPr>
+          <w:rFonts w:ascii="Times New Roman" w:hAnsi="Times New Roman" w:cs="Times New Roman"/>
+        </w:rPr>
+        <w:t>. Write any one use of a measuring cylinder.</w:t>
+      </w:r>
+    </w:p>
+    <w:p>
+      <w:pPr>
+        <w:pStyle w:val="Default"/>
+        <w:suppressAutoHyphens/>
+        <w:spacing w:before="0" w:line="240" w:lineRule="auto"/>
+        <w:rPr>
+          <w:rFonts w:ascii="Times New Roman" w:eastAsia="Times New Roman" w:hAnsi="Times New Roman" w:cs="Times New Roman"/>
+        </w:rPr>
+      </w:pPr>
+      <w:r>
+        <w:rPr>
+          <w:rFonts w:ascii="Times New Roman" w:hAnsi="Times New Roman" w:cs="Times New Roman"/>
+        </w:rPr>
+        <w:t>b</w:t>
+      </w:r>
+      <w:r>
+        <w:rPr>
+          <w:rFonts w:ascii="Times New Roman" w:hAnsi="Times New Roman" w:cs="Times New Roman"/>
+        </w:rPr>
+        <w:t xml:space="preserve">. What happens when we expose </w:t>
+      </w:r>
+      <w:r>
+        <w:rPr>
+          <w:rFonts w:ascii="Times New Roman" w:hAnsi="Times New Roman" w:cs="Times New Roman"/>
+        </w:rPr>
+        <w:t>Jamara</w:t>
+      </w:r>
+      <w:r>
+        <w:rPr>
+          <w:rFonts w:ascii="Times New Roman" w:hAnsi="Times New Roman" w:cs="Times New Roman"/>
+        </w:rPr>
+        <w:t xml:space="preserve"> to light?</w:t>
+      </w:r>
+    </w:p>
+    <w:p>
+      <w:pPr>
+        <w:pStyle w:val="Default"/>
+        <w:suppressAutoHyphens/>
+        <w:spacing w:before="0" w:line="240" w:lineRule="auto"/>
+        <w:rPr>
+          <w:rFonts w:ascii="Times New Roman" w:eastAsia="Times New Roman" w:hAnsi="Times New Roman" w:cs="Times New Roman"/>
+        </w:rPr>
+      </w:pPr>
+      <w:r>
+        <w:rPr>
+          <w:rFonts w:ascii="Times New Roman" w:hAnsi="Times New Roman" w:cs="Times New Roman"/>
+        </w:rPr>
+        <w:t>c</w:t>
+      </w:r>
+      <w:r>
+        <w:rPr>
+          <w:rFonts w:ascii="Times New Roman" w:hAnsi="Times New Roman" w:cs="Times New Roman"/>
+        </w:rPr>
+        <w:t>. Write any one effect of misuse of energy.</w:t>
+      </w:r>
+    </w:p>
+    <w:p>
+      <w:pPr>
+        <w:pStyle w:val="Default"/>
+        <w:suppressAutoHyphens/>
+        <w:spacing w:before="0" w:line="240" w:lineRule="auto"/>
+        <w:rPr>
+          <w:rFonts w:ascii="Times New Roman" w:eastAsia="Times New Roman" w:hAnsi="Times New Roman" w:cs="Times New Roman"/>
+        </w:rPr>
+      </w:pPr>
+      <w:r>
+        <w:rPr>
+          <w:rFonts w:ascii="Times New Roman" w:hAnsi="Times New Roman" w:cs="Times New Roman"/>
+        </w:rPr>
+        <w:t>d</w:t>
+      </w:r>
+      <w:r>
+        <w:rPr>
+          <w:rFonts w:ascii="Times New Roman" w:hAnsi="Times New Roman" w:cs="Times New Roman"/>
+        </w:rPr>
+        <w:t>. Define energy.</w:t>
+      </w:r>
+    </w:p>
+    <w:p>
+      <w:pPr>
+        <w:pStyle w:val="Default"/>
+        <w:suppressAutoHyphens/>
+        <w:spacing w:before="0" w:line="240" w:lineRule="auto"/>
+        <w:rPr>
+          <w:rFonts w:ascii="Times New Roman" w:eastAsia="Times New Roman" w:hAnsi="Times New Roman" w:cs="Times New Roman"/>
+        </w:rPr>
+      </w:pPr>
+      <w:r>
+        <w:rPr>
+          <w:rFonts w:ascii="Times New Roman" w:hAnsi="Times New Roman" w:cs="Times New Roman"/>
+        </w:rPr>
+        <w:t>e</w:t>
+      </w:r>
+      <w:r>
+        <w:rPr>
+          <w:rFonts w:ascii="Times New Roman" w:hAnsi="Times New Roman" w:cs="Times New Roman"/>
+        </w:rPr>
+        <w:t>. Write any two parts of a plant.</w:t>
+      </w:r>
+    </w:p>
+    <w:p>
+      <w:pPr>
+        <w:pStyle w:val="Default"/>
+        <w:suppressAutoHyphens/>
+        <w:spacing w:before="0" w:line="240" w:lineRule="auto"/>
+        <w:rPr>
+          <w:rFonts w:ascii="Times New Roman" w:eastAsia="Times New Roman" w:hAnsi="Times New Roman" w:cs="Times New Roman"/>
+        </w:rPr>
+      </w:pPr>
+      <w:r>
+        <w:rPr>
+          <w:rFonts w:ascii="Times New Roman" w:hAnsi="Times New Roman" w:cs="Times New Roman"/>
+        </w:rPr>
+        <w:t>f</w:t>
+      </w:r>
+      <w:r>
+        <w:rPr>
+          <w:rFonts w:ascii="Times New Roman" w:hAnsi="Times New Roman" w:cs="Times New Roman"/>
+        </w:rPr>
+        <w:t>. What are the two main groups of animals?</w:t>
+      </w:r>
+    </w:p>
+    <w:p>
+      <w:pPr>
+        <w:pStyle w:val="Default"/>
+        <w:suppressAutoHyphens/>
+        <w:spacing w:before="0" w:line="240" w:lineRule="auto"/>
+        <w:rPr>
+          <w:rFonts w:ascii="Times New Roman" w:hAnsi="Times New Roman" w:cs="Times New Roman"/>
+        </w:rPr>
+      </w:pPr>
+      <w:r>
+        <w:rPr>
+          <w:rFonts w:ascii="Times New Roman" w:hAnsi="Times New Roman" w:cs="Times New Roman"/>
+        </w:rPr>
+        <w:t>g</w:t>
+      </w:r>
+      <w:r>
+        <w:rPr>
+          <w:rFonts w:ascii="Times New Roman" w:hAnsi="Times New Roman" w:cs="Times New Roman"/>
+        </w:rPr>
+        <w:t>. Which organ is involved in human excretion?</w:t>
+      </w:r>
+    </w:p>
+    <w:p>
+      <w:pPr>
+        <w:pStyle w:val="Default"/>
+        <w:suppressAutoHyphens/>
+        <w:spacing w:before="0" w:line="240" w:lineRule="auto"/>
+        <w:rPr>
+          <w:rFonts w:ascii="Times New Roman" w:eastAsia="Times New Roman" w:hAnsi="Times New Roman" w:cs="Times New Roman"/>
+        </w:rPr>
+      </w:pPr>
+      <w:r>
+        <w:rPr>
+          <w:rFonts w:ascii="Times New Roman" w:hAnsi="Times New Roman" w:cs="Times New Roman"/>
+        </w:rPr>
+        <w:t>h. What is brass made of?</w:t>
       </w:r>
     </w:p>
     <w:p>
@@ -1754,7 +2171,31 @@
         <w:rPr>
           <w:rFonts w:ascii="Times New Roman" w:hAnsi="Times New Roman" w:cs="Times New Roman"/>
         </w:rPr>
-        <w:t>19. The ongoing ICC T-20 World Cup is being telecast live all over the world.</w:t>
+        <w:t>3</w:t>
+      </w:r>
+      <w:r>
+        <w:rPr>
+          <w:rFonts w:ascii="Times New Roman" w:hAnsi="Times New Roman" w:cs="Times New Roman"/>
+        </w:rPr>
+        <w:t xml:space="preserve">. </w:t>
+      </w:r>
+      <w:r>
+        <w:rPr>
+          <w:rFonts w:ascii="Times New Roman" w:hAnsi="Times New Roman" w:cs="Times New Roman"/>
+        </w:rPr>
+        <w:t>“</w:t>
+      </w:r>
+      <w:r>
+        <w:rPr>
+          <w:rFonts w:ascii="Times New Roman" w:hAnsi="Times New Roman" w:cs="Times New Roman"/>
+        </w:rPr>
+        <w:t>The ongoing ICC T-20 World Cup is being telecast live all over the world.</w:t>
+      </w:r>
+      <w:r>
+        <w:rPr>
+          <w:rFonts w:ascii="Times New Roman" w:hAnsi="Times New Roman" w:cs="Times New Roman"/>
+        </w:rPr>
+        <w:t>”  Based on this information answer the following questions.</w:t>
       </w:r>
     </w:p>
     <w:p>
@@ -1795,133 +2236,124 @@
         <w:suppressAutoHyphens/>
         <w:spacing w:before="0" w:line="240" w:lineRule="auto"/>
         <w:rPr>
-          <w:rFonts w:ascii="Times New Roman" w:hAnsi="Times New Roman" w:cs="Times New Roman"/>
-        </w:rPr>
-      </w:pPr>
-    </w:p>
-    <w:p>
-      <w:pPr>
-        <w:pStyle w:val="Default"/>
-        <w:suppressAutoHyphens/>
-        <w:spacing w:before="0" w:line="240" w:lineRule="auto"/>
-        <w:rPr>
-          <w:rFonts w:ascii="Times New Roman" w:eastAsia="Times New Roman" w:hAnsi="Times New Roman" w:cs="Times New Roman"/>
-        </w:rPr>
-      </w:pPr>
-      <w:r>
-        <w:rPr>
-          <w:rFonts w:ascii="Times New Roman" w:hAnsi="Times New Roman" w:cs="Times New Roman"/>
-        </w:rPr>
-        <w:lastRenderedPageBreak/>
-        <w:t>20. Why is a crane called a heterotroph?</w:t>
-      </w:r>
-    </w:p>
-    <w:p>
-      <w:pPr>
-        <w:pStyle w:val="Default"/>
-        <w:suppressAutoHyphens/>
-        <w:spacing w:before="0" w:line="240" w:lineRule="auto"/>
-        <w:rPr>
-          <w:rFonts w:ascii="Times New Roman" w:eastAsia="Times New Roman" w:hAnsi="Times New Roman" w:cs="Times New Roman"/>
-        </w:rPr>
-      </w:pPr>
-      <w:r>
-        <w:rPr>
-          <w:rFonts w:ascii="Times New Roman" w:hAnsi="Times New Roman" w:cs="Times New Roman"/>
-        </w:rPr>
-        <w:t>21. How is heat produced in our body? Write any two uses of heat energy.</w:t>
-      </w:r>
-    </w:p>
-    <w:p>
-      <w:pPr>
-        <w:pStyle w:val="Default"/>
-        <w:suppressAutoHyphens/>
-        <w:spacing w:before="0" w:line="240" w:lineRule="auto"/>
-        <w:rPr>
-          <w:rFonts w:ascii="Times New Roman" w:eastAsia="Times New Roman" w:hAnsi="Times New Roman" w:cs="Times New Roman"/>
-        </w:rPr>
-      </w:pPr>
-      <w:r>
-        <w:rPr>
-          <w:rFonts w:ascii="Times New Roman" w:hAnsi="Times New Roman" w:cs="Times New Roman"/>
-        </w:rPr>
-        <w:t xml:space="preserve">22. The </w:t>
-      </w:r>
-      <w:proofErr w:type="spellStart"/>
-      <w:r>
-        <w:rPr>
-          <w:rFonts w:ascii="Times New Roman" w:hAnsi="Times New Roman" w:cs="Times New Roman"/>
-        </w:rPr>
-        <w:t>colour</w:t>
-      </w:r>
-      <w:proofErr w:type="spellEnd"/>
-      <w:r>
-        <w:rPr>
-          <w:rFonts w:ascii="Times New Roman" w:hAnsi="Times New Roman" w:cs="Times New Roman"/>
-        </w:rPr>
-        <w:t xml:space="preserve"> of Taj Mahal changed from white to yellowish in 1980. What are the reasons behind this change? Write any two.</w:t>
-      </w:r>
-    </w:p>
-    <w:p>
-      <w:pPr>
-        <w:pStyle w:val="Default"/>
-        <w:suppressAutoHyphens/>
-        <w:spacing w:before="0" w:line="240" w:lineRule="auto"/>
-        <w:rPr>
-          <w:rFonts w:ascii="Times New Roman" w:eastAsia="Times New Roman" w:hAnsi="Times New Roman" w:cs="Times New Roman"/>
-        </w:rPr>
-      </w:pPr>
-      <w:r>
-        <w:rPr>
-          <w:rFonts w:ascii="Times New Roman" w:hAnsi="Times New Roman" w:cs="Times New Roman"/>
-        </w:rPr>
-        <w:t>23. Write any two ways to conserve energy.</w:t>
-      </w:r>
-    </w:p>
-    <w:p>
-      <w:pPr>
-        <w:pStyle w:val="Default"/>
-        <w:suppressAutoHyphens/>
-        <w:spacing w:before="0" w:line="240" w:lineRule="auto"/>
-        <w:rPr>
-          <w:rFonts w:ascii="Times New Roman" w:eastAsia="Times New Roman" w:hAnsi="Times New Roman" w:cs="Times New Roman"/>
-        </w:rPr>
-      </w:pPr>
-      <w:r>
-        <w:rPr>
-          <w:rFonts w:ascii="Times New Roman" w:hAnsi="Times New Roman" w:cs="Times New Roman"/>
-        </w:rPr>
-        <w:t>24. Write down the class of animals having the following features:</w:t>
-      </w:r>
-    </w:p>
-    <w:p>
-      <w:pPr>
-        <w:pStyle w:val="Default"/>
-        <w:suppressAutoHyphens/>
-        <w:spacing w:before="0" w:line="240" w:lineRule="auto"/>
-        <w:rPr>
-          <w:rFonts w:ascii="Times New Roman" w:eastAsia="Times New Roman" w:hAnsi="Times New Roman" w:cs="Times New Roman"/>
-        </w:rPr>
-      </w:pPr>
-      <w:r>
-        <w:rPr>
-          <w:rFonts w:ascii="Times New Roman" w:hAnsi="Times New Roman" w:cs="Times New Roman"/>
-        </w:rPr>
-        <w:t xml:space="preserve">  </w:t>
-      </w:r>
-      <w:proofErr w:type="spellStart"/>
-      <w:r>
-        <w:rPr>
-          <w:rFonts w:ascii="Times New Roman" w:hAnsi="Times New Roman" w:cs="Times New Roman"/>
-        </w:rPr>
-        <w:t>i</w:t>
-      </w:r>
-      <w:proofErr w:type="spellEnd"/>
-      <w:r>
-        <w:rPr>
-          <w:rFonts w:ascii="Times New Roman" w:hAnsi="Times New Roman" w:cs="Times New Roman"/>
-        </w:rPr>
-        <w:t>. Crawls on the land and lay eggs.</w:t>
+          <w:rFonts w:ascii="Times New Roman" w:eastAsia="Times New Roman" w:hAnsi="Times New Roman" w:cs="Times New Roman"/>
+        </w:rPr>
+      </w:pPr>
+      <w:r>
+        <w:rPr>
+          <w:rFonts w:ascii="Times New Roman" w:hAnsi="Times New Roman" w:cs="Times New Roman"/>
+        </w:rPr>
+        <w:t>4</w:t>
+      </w:r>
+      <w:r>
+        <w:rPr>
+          <w:rFonts w:ascii="Times New Roman" w:hAnsi="Times New Roman" w:cs="Times New Roman"/>
+        </w:rPr>
+        <w:t>. Why is a crane called a heterotroph?</w:t>
+      </w:r>
+    </w:p>
+    <w:p>
+      <w:pPr>
+        <w:pStyle w:val="Default"/>
+        <w:suppressAutoHyphens/>
+        <w:spacing w:before="0" w:line="240" w:lineRule="auto"/>
+        <w:rPr>
+          <w:rFonts w:ascii="Times New Roman" w:eastAsia="Times New Roman" w:hAnsi="Times New Roman" w:cs="Times New Roman"/>
+        </w:rPr>
+      </w:pPr>
+      <w:r>
+        <w:rPr>
+          <w:rFonts w:ascii="Times New Roman" w:hAnsi="Times New Roman" w:cs="Times New Roman"/>
+        </w:rPr>
+        <w:t>5</w:t>
+      </w:r>
+      <w:r>
+        <w:rPr>
+          <w:rFonts w:ascii="Times New Roman" w:hAnsi="Times New Roman" w:cs="Times New Roman"/>
+        </w:rPr>
+        <w:t>. How is heat produced in our body? Write any two uses of heat energy.</w:t>
+      </w:r>
+    </w:p>
+    <w:p>
+      <w:pPr>
+        <w:pStyle w:val="Default"/>
+        <w:suppressAutoHyphens/>
+        <w:spacing w:before="0" w:line="240" w:lineRule="auto"/>
+        <w:rPr>
+          <w:rFonts w:ascii="Times New Roman" w:eastAsia="Times New Roman" w:hAnsi="Times New Roman" w:cs="Times New Roman"/>
+        </w:rPr>
+      </w:pPr>
+      <w:r>
+        <w:rPr>
+          <w:rFonts w:ascii="Times New Roman" w:hAnsi="Times New Roman" w:cs="Times New Roman"/>
+        </w:rPr>
+        <w:t>6</w:t>
+      </w:r>
+      <w:r>
+        <w:rPr>
+          <w:rFonts w:ascii="Times New Roman" w:hAnsi="Times New Roman" w:cs="Times New Roman"/>
+        </w:rPr>
+        <w:t>. The colour of Taj Mahal changed from white to yellowish in 1980. What are the reasons behind this change? Write any two.</w:t>
+      </w:r>
+    </w:p>
+    <w:p>
+      <w:pPr>
+        <w:pStyle w:val="Default"/>
+        <w:suppressAutoHyphens/>
+        <w:spacing w:before="0" w:line="240" w:lineRule="auto"/>
+        <w:rPr>
+          <w:rFonts w:ascii="Times New Roman" w:eastAsia="Times New Roman" w:hAnsi="Times New Roman" w:cs="Times New Roman"/>
+        </w:rPr>
+      </w:pPr>
+      <w:r>
+        <w:rPr>
+          <w:rFonts w:ascii="Times New Roman" w:hAnsi="Times New Roman" w:cs="Times New Roman"/>
+        </w:rPr>
+        <w:t>7</w:t>
+      </w:r>
+      <w:r>
+        <w:rPr>
+          <w:rFonts w:ascii="Times New Roman" w:hAnsi="Times New Roman" w:cs="Times New Roman"/>
+        </w:rPr>
+        <w:t>. Write any two ways to conserve energy.</w:t>
+      </w:r>
+    </w:p>
+    <w:p>
+      <w:pPr>
+        <w:pStyle w:val="Default"/>
+        <w:suppressAutoHyphens/>
+        <w:spacing w:before="0" w:line="240" w:lineRule="auto"/>
+        <w:rPr>
+          <w:rFonts w:ascii="Times New Roman" w:eastAsia="Times New Roman" w:hAnsi="Times New Roman" w:cs="Times New Roman"/>
+        </w:rPr>
+      </w:pPr>
+      <w:r>
+        <w:rPr>
+          <w:rFonts w:ascii="Times New Roman" w:hAnsi="Times New Roman" w:cs="Times New Roman"/>
+        </w:rPr>
+        <w:t>8</w:t>
+      </w:r>
+      <w:r>
+        <w:rPr>
+          <w:rFonts w:ascii="Times New Roman" w:hAnsi="Times New Roman" w:cs="Times New Roman"/>
+        </w:rPr>
+        <w:t>. Write down the class of animals having the following features:</w:t>
+      </w:r>
+    </w:p>
+    <w:p>
+      <w:pPr>
+        <w:pStyle w:val="Default"/>
+        <w:suppressAutoHyphens/>
+        <w:spacing w:before="0" w:line="240" w:lineRule="auto"/>
+        <w:rPr>
+          <w:rFonts w:ascii="Times New Roman" w:eastAsia="Times New Roman" w:hAnsi="Times New Roman" w:cs="Times New Roman"/>
+        </w:rPr>
+      </w:pPr>
+      <w:r>
+        <w:rPr>
+          <w:rFonts w:ascii="Times New Roman" w:hAnsi="Times New Roman" w:cs="Times New Roman"/>
+        </w:rPr>
+        <w:t xml:space="preserve">  i. Crawls on the land and lay eggs.</w:t>
       </w:r>
     </w:p>
     <w:p>
@@ -1953,228 +2385,49 @@
         <w:rPr>
           <w:rFonts w:ascii="Times New Roman" w:hAnsi="Times New Roman" w:cs="Times New Roman"/>
         </w:rPr>
-        <w:t>25. Which people are likely to snore during their sleep?</w:t>
-      </w:r>
-    </w:p>
-    <w:p>
-      <w:pPr>
-        <w:pStyle w:val="Default"/>
-        <w:suppressAutoHyphens/>
-        <w:spacing w:before="0" w:line="240" w:lineRule="auto"/>
-        <w:rPr>
-          <w:rFonts w:ascii="Times New Roman" w:eastAsia="Times New Roman" w:hAnsi="Times New Roman" w:cs="Times New Roman"/>
-        </w:rPr>
-      </w:pPr>
-      <w:r>
-        <w:rPr>
-          <w:rFonts w:ascii="Times New Roman" w:hAnsi="Times New Roman" w:cs="Times New Roman"/>
-        </w:rPr>
-        <w:t>26. Identify the solid, liquid and gas according to given molecular arrangement:</w:t>
-      </w:r>
-    </w:p>
-    <w:p>
-      <w:pPr>
-        <w:pStyle w:val="Default"/>
-        <w:suppressAutoHyphens/>
-        <w:spacing w:before="0" w:line="240" w:lineRule="auto"/>
-        <w:rPr>
-          <w:rFonts w:ascii="Times New Roman" w:eastAsia="Times New Roman" w:hAnsi="Times New Roman" w:cs="Times New Roman"/>
-        </w:rPr>
-      </w:pPr>
+        <w:t>9</w:t>
+      </w:r>
+      <w:r>
+        <w:rPr>
+          <w:rFonts w:ascii="Times New Roman" w:hAnsi="Times New Roman" w:cs="Times New Roman"/>
+        </w:rPr>
+        <w:t>. Which people are likely to snore during their sleep?</w:t>
+      </w:r>
+    </w:p>
+    <w:p>
+      <w:pPr>
+        <w:pStyle w:val="Default"/>
+        <w:suppressAutoHyphens/>
+        <w:spacing w:before="0" w:line="240" w:lineRule="auto"/>
+        <w:rPr>
+          <w:rFonts w:ascii="Times New Roman" w:eastAsia="Times New Roman" w:hAnsi="Times New Roman" w:cs="Times New Roman"/>
+        </w:rPr>
+      </w:pPr>
+      <w:r>
+        <w:rPr>
+          <w:rFonts w:ascii="Times New Roman" w:hAnsi="Times New Roman" w:cs="Times New Roman"/>
+        </w:rPr>
+        <w:t>10</w:t>
+      </w:r>
+      <w:r>
+        <w:rPr>
+          <w:rFonts w:ascii="Times New Roman" w:hAnsi="Times New Roman" w:cs="Times New Roman"/>
+        </w:rPr>
+        <w:t xml:space="preserve">. Identify the solid, liquid and gas according to given molecular </w:t>
+      </w:r>
       <w:r>
         <w:rPr>
           <w:rFonts w:ascii="Times New Roman" w:eastAsia="Times New Roman" w:hAnsi="Times New Roman" w:cs="Times New Roman"/>
           <w:noProof/>
         </w:rPr>
         <w:drawing>
-          <wp:anchor distT="152400" distB="152400" distL="152400" distR="152400" simplePos="0" relativeHeight="251659264" behindDoc="0" locked="0" layoutInCell="1" allowOverlap="1" wp14:anchorId="4AE7D983" wp14:editId="6137D416">
+          <wp:anchor distT="152400" distB="152400" distL="152400" distR="152400" simplePos="0" relativeHeight="251661312" behindDoc="0" locked="0" layoutInCell="1" allowOverlap="1" wp14:anchorId="11969D84" wp14:editId="069487BA">
             <wp:simplePos x="0" y="0"/>
             <wp:positionH relativeFrom="margin">
-              <wp:posOffset>474345</wp:posOffset>
+              <wp:posOffset>7100510</wp:posOffset>
             </wp:positionH>
             <wp:positionV relativeFrom="line">
-              <wp:posOffset>123574</wp:posOffset>
-            </wp:positionV>
-            <wp:extent cx="1500996" cy="1604513"/>
-            <wp:effectExtent l="0" t="0" r="4445" b="0"/>
-            <wp:wrapNone/>
-            <wp:docPr id="1073741825" name="officeArt object" descr="d3bb7f4f-4618-4f08-83a2-78cc86f2774c.jpeg"/>
-            <wp:cNvGraphicFramePr/>
-            <a:graphic xmlns:a="http://schemas.openxmlformats.org/drawingml/2006/main">
-              <a:graphicData uri="http://schemas.openxmlformats.org/drawingml/2006/picture">
-                <pic:pic xmlns:pic="http://schemas.openxmlformats.org/drawingml/2006/picture">
-                  <pic:nvPicPr>
-                    <pic:cNvPr id="1073741825" name="d3bb7f4f-4618-4f08-83a2-78cc86f2774c.jpeg" descr="d3bb7f4f-4618-4f08-83a2-78cc86f2774c.jpeg"/>
-                    <pic:cNvPicPr>
-                      <a:picLocks noChangeAspect="1"/>
-                    </pic:cNvPicPr>
-                  </pic:nvPicPr>
-                  <pic:blipFill rotWithShape="1">
-                    <a:blip r:embed="rId7"/>
-                    <a:srcRect l="10336" t="9542" r="13234" b="12197"/>
-                    <a:stretch>
-                      <a:fillRect/>
-                    </a:stretch>
-                  </pic:blipFill>
-                  <pic:spPr bwMode="auto">
-                    <a:xfrm>
-                      <a:off x="0" y="0"/>
-                      <a:ext cx="1500996" cy="1604513"/>
-                    </a:xfrm>
-                    <a:prstGeom prst="rect">
-                      <a:avLst/>
-                    </a:prstGeom>
-                    <a:ln>
-                      <a:noFill/>
-                    </a:ln>
-                    <a:effectLst/>
-                    <a:extLst>
-                      <a:ext uri="{53640926-AAD7-44D8-BBD7-CCE9431645EC}">
-                        <a14:shadowObscured xmlns:a14="http://schemas.microsoft.com/office/drawing/2010/main"/>
-                      </a:ext>
-                    </a:extLst>
-                  </pic:spPr>
-                </pic:pic>
-              </a:graphicData>
-            </a:graphic>
-            <wp14:sizeRelH relativeFrom="margin">
-              <wp14:pctWidth>0</wp14:pctWidth>
-            </wp14:sizeRelH>
-            <wp14:sizeRelV relativeFrom="margin">
-              <wp14:pctHeight>0</wp14:pctHeight>
-            </wp14:sizeRelV>
-          </wp:anchor>
-        </w:drawing>
-      </w:r>
-      <w:r>
-        <w:rPr>
-          <w:rFonts w:ascii="Times New Roman" w:hAnsi="Times New Roman" w:cs="Times New Roman"/>
-        </w:rPr>
-        <w:t xml:space="preserve">  </w:t>
-      </w:r>
-      <w:proofErr w:type="spellStart"/>
-      <w:r>
-        <w:rPr>
-          <w:rFonts w:ascii="Times New Roman" w:hAnsi="Times New Roman" w:cs="Times New Roman"/>
-        </w:rPr>
-        <w:t>i</w:t>
-      </w:r>
-      <w:proofErr w:type="spellEnd"/>
-      <w:r>
-        <w:rPr>
-          <w:rFonts w:ascii="Times New Roman" w:hAnsi="Times New Roman" w:cs="Times New Roman"/>
-        </w:rPr>
-        <w:t xml:space="preserve">.  </w:t>
-      </w:r>
-    </w:p>
-    <w:p>
-      <w:pPr>
-        <w:pStyle w:val="Default"/>
-        <w:suppressAutoHyphens/>
-        <w:spacing w:before="0" w:line="240" w:lineRule="auto"/>
-        <w:rPr>
-          <w:rFonts w:ascii="Times New Roman" w:hAnsi="Times New Roman" w:cs="Times New Roman"/>
-        </w:rPr>
-      </w:pPr>
-      <w:r>
-        <w:rPr>
-          <w:rFonts w:ascii="Times New Roman" w:hAnsi="Times New Roman" w:cs="Times New Roman"/>
-        </w:rPr>
-        <w:t xml:space="preserve">  </w:t>
-      </w:r>
-    </w:p>
-    <w:p>
-      <w:pPr>
-        <w:pStyle w:val="Default"/>
-        <w:suppressAutoHyphens/>
-        <w:spacing w:before="0" w:line="240" w:lineRule="auto"/>
-        <w:rPr>
-          <w:rFonts w:ascii="Times New Roman" w:hAnsi="Times New Roman" w:cs="Times New Roman"/>
-        </w:rPr>
-      </w:pPr>
-    </w:p>
-    <w:p>
-      <w:pPr>
-        <w:pStyle w:val="Default"/>
-        <w:suppressAutoHyphens/>
-        <w:spacing w:before="0" w:line="240" w:lineRule="auto"/>
-        <w:rPr>
-          <w:rFonts w:ascii="Times New Roman" w:hAnsi="Times New Roman" w:cs="Times New Roman"/>
-        </w:rPr>
-      </w:pPr>
-    </w:p>
-    <w:p>
-      <w:pPr>
-        <w:pStyle w:val="Default"/>
-        <w:suppressAutoHyphens/>
-        <w:spacing w:before="0" w:line="240" w:lineRule="auto"/>
-        <w:rPr>
-          <w:rFonts w:ascii="Times New Roman" w:hAnsi="Times New Roman" w:cs="Times New Roman"/>
-        </w:rPr>
-      </w:pPr>
-    </w:p>
-    <w:p>
-      <w:pPr>
-        <w:pStyle w:val="Default"/>
-        <w:suppressAutoHyphens/>
-        <w:spacing w:before="0" w:line="240" w:lineRule="auto"/>
-        <w:rPr>
-          <w:rFonts w:ascii="Times New Roman" w:hAnsi="Times New Roman" w:cs="Times New Roman"/>
-        </w:rPr>
-      </w:pPr>
-    </w:p>
-    <w:p>
-      <w:pPr>
-        <w:pStyle w:val="Default"/>
-        <w:suppressAutoHyphens/>
-        <w:spacing w:before="0" w:line="240" w:lineRule="auto"/>
-        <w:rPr>
-          <w:rFonts w:ascii="Times New Roman" w:hAnsi="Times New Roman" w:cs="Times New Roman"/>
-        </w:rPr>
-      </w:pPr>
-    </w:p>
-    <w:p>
-      <w:pPr>
-        <w:pStyle w:val="Default"/>
-        <w:suppressAutoHyphens/>
-        <w:spacing w:before="0" w:line="240" w:lineRule="auto"/>
-        <w:rPr>
-          <w:rFonts w:ascii="Times New Roman" w:hAnsi="Times New Roman" w:cs="Times New Roman"/>
-        </w:rPr>
-      </w:pPr>
-    </w:p>
-    <w:p>
-      <w:pPr>
-        <w:pStyle w:val="Default"/>
-        <w:suppressAutoHyphens/>
-        <w:spacing w:before="0" w:line="240" w:lineRule="auto"/>
-        <w:rPr>
-          <w:rFonts w:ascii="Times New Roman" w:hAnsi="Times New Roman" w:cs="Times New Roman"/>
-        </w:rPr>
-      </w:pPr>
-    </w:p>
-    <w:p>
-      <w:pPr>
-        <w:pStyle w:val="Default"/>
-        <w:suppressAutoHyphens/>
-        <w:spacing w:before="0" w:line="240" w:lineRule="auto"/>
-        <w:rPr>
-          <w:rFonts w:ascii="Times New Roman" w:hAnsi="Times New Roman" w:cs="Times New Roman"/>
-        </w:rPr>
-      </w:pPr>
-      <w:r>
-        <w:rPr>
-          <w:rFonts w:ascii="Times New Roman" w:eastAsia="Times New Roman" w:hAnsi="Times New Roman" w:cs="Times New Roman"/>
-          <w:noProof/>
-        </w:rPr>
-        <w:drawing>
-          <wp:anchor distT="152400" distB="152400" distL="152400" distR="152400" simplePos="0" relativeHeight="251661312" behindDoc="0" locked="0" layoutInCell="1" allowOverlap="1" wp14:anchorId="11969D84" wp14:editId="464A486C">
-            <wp:simplePos x="0" y="0"/>
-            <wp:positionH relativeFrom="margin">
-              <wp:posOffset>581026</wp:posOffset>
-            </wp:positionH>
-            <wp:positionV relativeFrom="line">
-              <wp:posOffset>152400</wp:posOffset>
+              <wp:posOffset>163830</wp:posOffset>
             </wp:positionV>
             <wp:extent cx="1395730" cy="1543050"/>
             <wp:effectExtent l="0" t="0" r="0" b="0"/>
@@ -2191,7 +2444,7 @@
                     </pic:cNvPicPr>
                   </pic:nvPicPr>
                   <pic:blipFill rotWithShape="1">
-                    <a:blip r:embed="rId8"/>
+                    <a:blip r:embed="rId7"/>
                     <a:srcRect l="16445" t="3236" r="10865" b="11024"/>
                     <a:stretch>
                       <a:fillRect/>
@@ -2227,153 +2480,37 @@
           </wp:anchor>
         </w:drawing>
       </w:r>
-    </w:p>
-    <w:p>
-      <w:pPr>
-        <w:pStyle w:val="Default"/>
-        <w:suppressAutoHyphens/>
-        <w:spacing w:before="0" w:line="240" w:lineRule="auto"/>
-        <w:rPr>
-          <w:rFonts w:ascii="Times New Roman" w:hAnsi="Times New Roman" w:cs="Times New Roman"/>
-        </w:rPr>
-      </w:pPr>
-    </w:p>
-    <w:p>
-      <w:pPr>
-        <w:pStyle w:val="Default"/>
-        <w:suppressAutoHyphens/>
-        <w:spacing w:before="0" w:line="240" w:lineRule="auto"/>
-        <w:rPr>
-          <w:rFonts w:ascii="Times New Roman" w:hAnsi="Times New Roman" w:cs="Times New Roman"/>
-        </w:rPr>
-      </w:pPr>
-    </w:p>
-    <w:p>
-      <w:pPr>
-        <w:pStyle w:val="Default"/>
-        <w:suppressAutoHyphens/>
-        <w:spacing w:before="0" w:line="240" w:lineRule="auto"/>
-        <w:rPr>
-          <w:rFonts w:ascii="Times New Roman" w:hAnsi="Times New Roman" w:cs="Times New Roman"/>
-        </w:rPr>
-      </w:pPr>
-    </w:p>
-    <w:p>
-      <w:pPr>
-        <w:pStyle w:val="Default"/>
-        <w:suppressAutoHyphens/>
-        <w:spacing w:before="0" w:line="240" w:lineRule="auto"/>
-        <w:rPr>
-          <w:rFonts w:ascii="Times New Roman" w:hAnsi="Times New Roman" w:cs="Times New Roman"/>
-        </w:rPr>
-      </w:pPr>
-    </w:p>
-    <w:p>
-      <w:pPr>
-        <w:pStyle w:val="Default"/>
-        <w:suppressAutoHyphens/>
-        <w:spacing w:before="0" w:line="240" w:lineRule="auto"/>
-        <w:rPr>
-          <w:rFonts w:ascii="Times New Roman" w:eastAsia="Times New Roman" w:hAnsi="Times New Roman" w:cs="Times New Roman"/>
-        </w:rPr>
-      </w:pPr>
-      <w:r>
-        <w:rPr>
-          <w:rFonts w:ascii="Times New Roman" w:hAnsi="Times New Roman" w:cs="Times New Roman"/>
-        </w:rPr>
-        <w:t xml:space="preserve">ii. </w:t>
-      </w:r>
-    </w:p>
-    <w:p>
-      <w:pPr>
-        <w:pStyle w:val="Default"/>
-        <w:suppressAutoHyphens/>
-        <w:spacing w:before="0" w:line="240" w:lineRule="auto"/>
-        <w:rPr>
-          <w:rFonts w:ascii="Times New Roman" w:hAnsi="Times New Roman" w:cs="Times New Roman"/>
-        </w:rPr>
-      </w:pPr>
-    </w:p>
-    <w:p>
-      <w:pPr>
-        <w:pStyle w:val="Default"/>
-        <w:suppressAutoHyphens/>
-        <w:spacing w:before="0" w:line="240" w:lineRule="auto"/>
-        <w:rPr>
-          <w:rFonts w:ascii="Times New Roman" w:hAnsi="Times New Roman" w:cs="Times New Roman"/>
-        </w:rPr>
-      </w:pPr>
-    </w:p>
-    <w:p>
-      <w:pPr>
-        <w:pStyle w:val="Default"/>
-        <w:suppressAutoHyphens/>
-        <w:spacing w:before="0" w:line="240" w:lineRule="auto"/>
-        <w:rPr>
-          <w:rFonts w:ascii="Times New Roman" w:hAnsi="Times New Roman" w:cs="Times New Roman"/>
-        </w:rPr>
-      </w:pPr>
-    </w:p>
-    <w:p>
-      <w:pPr>
-        <w:pStyle w:val="Default"/>
-        <w:suppressAutoHyphens/>
-        <w:spacing w:before="0" w:line="240" w:lineRule="auto"/>
-        <w:rPr>
-          <w:rFonts w:ascii="Times New Roman" w:hAnsi="Times New Roman" w:cs="Times New Roman"/>
-        </w:rPr>
-      </w:pPr>
-    </w:p>
-    <w:p>
-      <w:pPr>
-        <w:pStyle w:val="Default"/>
-        <w:suppressAutoHyphens/>
-        <w:spacing w:before="0" w:line="240" w:lineRule="auto"/>
-        <w:rPr>
-          <w:rFonts w:ascii="Times New Roman" w:hAnsi="Times New Roman" w:cs="Times New Roman"/>
-        </w:rPr>
-      </w:pPr>
-    </w:p>
-    <w:p>
-      <w:pPr>
-        <w:pStyle w:val="Default"/>
-        <w:suppressAutoHyphens/>
-        <w:spacing w:before="0" w:line="240" w:lineRule="auto"/>
-        <w:rPr>
-          <w:rFonts w:ascii="Times New Roman" w:hAnsi="Times New Roman" w:cs="Times New Roman"/>
-        </w:rPr>
-      </w:pPr>
       <w:r>
         <w:rPr>
           <w:rFonts w:ascii="Times New Roman" w:eastAsia="Times New Roman" w:hAnsi="Times New Roman" w:cs="Times New Roman"/>
           <w:noProof/>
         </w:rPr>
         <w:drawing>
-          <wp:anchor distT="152400" distB="152400" distL="152400" distR="152400" simplePos="0" relativeHeight="251660288" behindDoc="0" locked="0" layoutInCell="1" allowOverlap="1" wp14:anchorId="2CE43115" wp14:editId="04C28830">
+          <wp:anchor distT="152400" distB="152400" distL="152400" distR="152400" simplePos="0" relativeHeight="251659264" behindDoc="0" locked="0" layoutInCell="1" allowOverlap="1" wp14:anchorId="4AE7D983" wp14:editId="721AF5F5">
             <wp:simplePos x="0" y="0"/>
             <wp:positionH relativeFrom="margin">
-              <wp:posOffset>695325</wp:posOffset>
+              <wp:posOffset>5298836</wp:posOffset>
             </wp:positionH>
             <wp:positionV relativeFrom="line">
-              <wp:posOffset>130175</wp:posOffset>
+              <wp:posOffset>163231</wp:posOffset>
             </wp:positionV>
-            <wp:extent cx="1431925" cy="1526540"/>
-            <wp:effectExtent l="0" t="0" r="0" b="0"/>
+            <wp:extent cx="1500505" cy="1604010"/>
+            <wp:effectExtent l="0" t="0" r="4445" b="0"/>
             <wp:wrapNone/>
-            <wp:docPr id="1073741826" name="officeArt object" descr="d3bb7f4f-4618-4f08-83a2-78cc86f2774c.jpeg"/>
+            <wp:docPr id="1073741825" name="officeArt object" descr="d3bb7f4f-4618-4f08-83a2-78cc86f2774c.jpeg"/>
             <wp:cNvGraphicFramePr/>
             <a:graphic xmlns:a="http://schemas.openxmlformats.org/drawingml/2006/main">
               <a:graphicData uri="http://schemas.openxmlformats.org/drawingml/2006/picture">
                 <pic:pic xmlns:pic="http://schemas.openxmlformats.org/drawingml/2006/picture">
                   <pic:nvPicPr>
-                    <pic:cNvPr id="1073741826" name="d3bb7f4f-4618-4f08-83a2-78cc86f2774c.jpeg" descr="d3bb7f4f-4618-4f08-83a2-78cc86f2774c.jpeg"/>
+                    <pic:cNvPr id="1073741825" name="d3bb7f4f-4618-4f08-83a2-78cc86f2774c.jpeg" descr="d3bb7f4f-4618-4f08-83a2-78cc86f2774c.jpeg"/>
                     <pic:cNvPicPr>
                       <a:picLocks noChangeAspect="1"/>
                     </pic:cNvPicPr>
                   </pic:nvPicPr>
                   <pic:blipFill rotWithShape="1">
-                    <a:blip r:embed="rId9"/>
-                    <a:srcRect l="10171" t="3951" r="7704" b="5599"/>
+                    <a:blip r:embed="rId8"/>
+                    <a:srcRect l="10336" t="9542" r="13234" b="12197"/>
                     <a:stretch>
                       <a:fillRect/>
                     </a:stretch>
@@ -2381,7 +2518,7 @@
                   <pic:spPr bwMode="auto">
                     <a:xfrm>
                       <a:off x="0" y="0"/>
-                      <a:ext cx="1431925" cy="1526540"/>
+                      <a:ext cx="1500505" cy="1604010"/>
                     </a:xfrm>
                     <a:prstGeom prst="rect">
                       <a:avLst/>
@@ -2408,80 +2545,76 @@
           </wp:anchor>
         </w:drawing>
       </w:r>
-    </w:p>
-    <w:p>
-      <w:pPr>
-        <w:pStyle w:val="Default"/>
-        <w:suppressAutoHyphens/>
-        <w:spacing w:before="0" w:line="240" w:lineRule="auto"/>
-        <w:rPr>
-          <w:rFonts w:ascii="Times New Roman" w:hAnsi="Times New Roman" w:cs="Times New Roman"/>
-        </w:rPr>
-      </w:pPr>
-    </w:p>
-    <w:p>
-      <w:pPr>
-        <w:pStyle w:val="Default"/>
-        <w:suppressAutoHyphens/>
-        <w:spacing w:before="0" w:line="240" w:lineRule="auto"/>
-        <w:rPr>
-          <w:rFonts w:ascii="Times New Roman" w:hAnsi="Times New Roman" w:cs="Times New Roman"/>
-        </w:rPr>
-      </w:pPr>
-    </w:p>
-    <w:p>
-      <w:pPr>
-        <w:pStyle w:val="Default"/>
-        <w:suppressAutoHyphens/>
-        <w:spacing w:before="0" w:line="240" w:lineRule="auto"/>
-        <w:rPr>
-          <w:rFonts w:ascii="Times New Roman" w:hAnsi="Times New Roman" w:cs="Times New Roman"/>
-        </w:rPr>
-      </w:pPr>
-    </w:p>
-    <w:p>
-      <w:pPr>
-        <w:pStyle w:val="Default"/>
-        <w:suppressAutoHyphens/>
-        <w:spacing w:before="0" w:line="240" w:lineRule="auto"/>
-        <w:rPr>
-          <w:rFonts w:ascii="Times New Roman" w:hAnsi="Times New Roman" w:cs="Times New Roman"/>
-        </w:rPr>
-      </w:pPr>
-    </w:p>
-    <w:p>
-      <w:pPr>
-        <w:pStyle w:val="Default"/>
-        <w:suppressAutoHyphens/>
-        <w:spacing w:before="0" w:line="240" w:lineRule="auto"/>
-        <w:rPr>
-          <w:rFonts w:ascii="Times New Roman" w:hAnsi="Times New Roman" w:cs="Times New Roman"/>
-        </w:rPr>
-      </w:pPr>
-    </w:p>
-    <w:p>
-      <w:pPr>
-        <w:pStyle w:val="Default"/>
-        <w:suppressAutoHyphens/>
-        <w:spacing w:before="0" w:line="240" w:lineRule="auto"/>
-        <w:rPr>
-          <w:rFonts w:ascii="Times New Roman" w:hAnsi="Times New Roman" w:cs="Times New Roman"/>
-        </w:rPr>
-      </w:pPr>
-    </w:p>
-    <w:p>
-      <w:pPr>
-        <w:pStyle w:val="Default"/>
-        <w:suppressAutoHyphens/>
-        <w:spacing w:before="0" w:line="240" w:lineRule="auto"/>
-        <w:rPr>
-          <w:rFonts w:ascii="Times New Roman" w:eastAsia="Times New Roman" w:hAnsi="Times New Roman" w:cs="Times New Roman"/>
-        </w:rPr>
-      </w:pPr>
-      <w:r>
-        <w:rPr>
-          <w:rFonts w:ascii="Times New Roman" w:hAnsi="Times New Roman" w:cs="Times New Roman"/>
-        </w:rPr>
+      <w:r>
+        <w:rPr>
+          <w:rFonts w:ascii="Times New Roman" w:hAnsi="Times New Roman" w:cs="Times New Roman"/>
+        </w:rPr>
+        <w:t>arrangement:</w:t>
+      </w:r>
+    </w:p>
+    <w:p>
+      <w:pPr>
+        <w:pStyle w:val="Default"/>
+        <w:suppressAutoHyphens/>
+        <w:spacing w:before="0" w:line="240" w:lineRule="auto"/>
+        <w:rPr>
+          <w:rFonts w:ascii="Times New Roman" w:eastAsia="Times New Roman" w:hAnsi="Times New Roman" w:cs="Times New Roman"/>
+        </w:rPr>
+      </w:pPr>
+      <w:r>
+        <w:rPr>
+          <w:rFonts w:ascii="Times New Roman" w:hAnsi="Times New Roman" w:cs="Times New Roman"/>
+        </w:rPr>
+        <w:t xml:space="preserve">i.  </w:t>
+      </w:r>
+      <w:r>
+        <w:rPr>
+          <w:rFonts w:ascii="Times New Roman" w:hAnsi="Times New Roman" w:cs="Times New Roman"/>
+        </w:rPr>
+        <w:tab/>
+      </w:r>
+      <w:r>
+        <w:rPr>
+          <w:rFonts w:ascii="Times New Roman" w:hAnsi="Times New Roman" w:cs="Times New Roman"/>
+        </w:rPr>
+        <w:tab/>
+      </w:r>
+      <w:r>
+        <w:rPr>
+          <w:rFonts w:ascii="Times New Roman" w:hAnsi="Times New Roman" w:cs="Times New Roman"/>
+        </w:rPr>
+        <w:tab/>
+      </w:r>
+      <w:r>
+        <w:rPr>
+          <w:rFonts w:ascii="Times New Roman" w:hAnsi="Times New Roman" w:cs="Times New Roman"/>
+        </w:rPr>
+        <w:tab/>
+        <w:t xml:space="preserve">ii. </w:t>
+      </w:r>
+      <w:r>
+        <w:rPr>
+          <w:rFonts w:ascii="Times New Roman" w:hAnsi="Times New Roman" w:cs="Times New Roman"/>
+        </w:rPr>
+        <w:tab/>
+      </w:r>
+      <w:r>
+        <w:rPr>
+          <w:rFonts w:ascii="Times New Roman" w:hAnsi="Times New Roman" w:cs="Times New Roman"/>
+        </w:rPr>
+        <w:tab/>
+      </w:r>
+      <w:r>
+        <w:rPr>
+          <w:rFonts w:ascii="Times New Roman" w:hAnsi="Times New Roman" w:cs="Times New Roman"/>
+        </w:rPr>
+        <w:tab/>
+      </w:r>
+      <w:r>
+        <w:rPr>
+          <w:rFonts w:ascii="Times New Roman" w:hAnsi="Times New Roman" w:cs="Times New Roman"/>
+        </w:rPr>
+        <w:tab/>
         <w:t xml:space="preserve">iii. </w:t>
       </w:r>
     </w:p>
@@ -2491,7 +2624,178 @@
         <w:suppressAutoHyphens/>
         <w:spacing w:before="0" w:line="240" w:lineRule="auto"/>
         <w:rPr>
-          <w:rFonts w:ascii="Times New Roman" w:eastAsia="Times New Roman" w:hAnsi="Times New Roman" w:cs="Times New Roman"/>
+          <w:rFonts w:ascii="Times New Roman" w:hAnsi="Times New Roman" w:cs="Times New Roman"/>
+        </w:rPr>
+      </w:pPr>
+      <w:r>
+        <w:rPr>
+          <w:rFonts w:ascii="Times New Roman" w:eastAsia="Times New Roman" w:hAnsi="Times New Roman" w:cs="Times New Roman"/>
+          <w:noProof/>
+        </w:rPr>
+        <w:drawing>
+          <wp:anchor distT="152400" distB="152400" distL="152400" distR="152400" simplePos="0" relativeHeight="251660288" behindDoc="0" locked="0" layoutInCell="1" allowOverlap="1" wp14:anchorId="2CE43115" wp14:editId="0BE23AD3">
+            <wp:simplePos x="0" y="0"/>
+            <wp:positionH relativeFrom="margin">
+              <wp:posOffset>8781044</wp:posOffset>
+            </wp:positionH>
+            <wp:positionV relativeFrom="line">
+              <wp:posOffset>26035</wp:posOffset>
+            </wp:positionV>
+            <wp:extent cx="1302529" cy="1388517"/>
+            <wp:effectExtent l="0" t="0" r="0" b="2540"/>
+            <wp:wrapNone/>
+            <wp:docPr id="1073741826" name="officeArt object" descr="d3bb7f4f-4618-4f08-83a2-78cc86f2774c.jpeg"/>
+            <wp:cNvGraphicFramePr/>
+            <a:graphic xmlns:a="http://schemas.openxmlformats.org/drawingml/2006/main">
+              <a:graphicData uri="http://schemas.openxmlformats.org/drawingml/2006/picture">
+                <pic:pic xmlns:pic="http://schemas.openxmlformats.org/drawingml/2006/picture">
+                  <pic:nvPicPr>
+                    <pic:cNvPr id="1073741826" name="d3bb7f4f-4618-4f08-83a2-78cc86f2774c.jpeg" descr="d3bb7f4f-4618-4f08-83a2-78cc86f2774c.jpeg"/>
+                    <pic:cNvPicPr>
+                      <a:picLocks noChangeAspect="1"/>
+                    </pic:cNvPicPr>
+                  </pic:nvPicPr>
+                  <pic:blipFill rotWithShape="1">
+                    <a:blip r:embed="rId9"/>
+                    <a:srcRect l="10171" t="3951" r="7704" b="5599"/>
+                    <a:stretch>
+                      <a:fillRect/>
+                    </a:stretch>
+                  </pic:blipFill>
+                  <pic:spPr bwMode="auto">
+                    <a:xfrm>
+                      <a:off x="0" y="0"/>
+                      <a:ext cx="1302529" cy="1388517"/>
+                    </a:xfrm>
+                    <a:prstGeom prst="rect">
+                      <a:avLst/>
+                    </a:prstGeom>
+                    <a:ln>
+                      <a:noFill/>
+                    </a:ln>
+                    <a:effectLst/>
+                    <a:extLst>
+                      <a:ext uri="{53640926-AAD7-44D8-BBD7-CCE9431645EC}">
+                        <a14:shadowObscured xmlns:a14="http://schemas.microsoft.com/office/drawing/2010/main"/>
+                      </a:ext>
+                    </a:extLst>
+                  </pic:spPr>
+                </pic:pic>
+              </a:graphicData>
+            </a:graphic>
+            <wp14:sizeRelH relativeFrom="margin">
+              <wp14:pctWidth>0</wp14:pctWidth>
+            </wp14:sizeRelH>
+            <wp14:sizeRelV relativeFrom="margin">
+              <wp14:pctHeight>0</wp14:pctHeight>
+            </wp14:sizeRelV>
+          </wp:anchor>
+        </w:drawing>
+      </w:r>
+      <w:r>
+        <w:rPr>
+          <w:rFonts w:ascii="Times New Roman" w:hAnsi="Times New Roman" w:cs="Times New Roman"/>
+        </w:rPr>
+        <w:t xml:space="preserve">  </w:t>
+      </w:r>
+    </w:p>
+    <w:p>
+      <w:pPr>
+        <w:pStyle w:val="Default"/>
+        <w:suppressAutoHyphens/>
+        <w:spacing w:before="0" w:line="240" w:lineRule="auto"/>
+        <w:rPr>
+          <w:rFonts w:ascii="Times New Roman" w:hAnsi="Times New Roman" w:cs="Times New Roman"/>
+        </w:rPr>
+      </w:pPr>
+    </w:p>
+    <w:p>
+      <w:pPr>
+        <w:pStyle w:val="Default"/>
+        <w:suppressAutoHyphens/>
+        <w:spacing w:before="0" w:line="240" w:lineRule="auto"/>
+        <w:rPr>
+          <w:rFonts w:ascii="Times New Roman" w:hAnsi="Times New Roman" w:cs="Times New Roman"/>
+        </w:rPr>
+      </w:pPr>
+    </w:p>
+    <w:p>
+      <w:pPr>
+        <w:pStyle w:val="Default"/>
+        <w:suppressAutoHyphens/>
+        <w:spacing w:before="0" w:line="240" w:lineRule="auto"/>
+        <w:rPr>
+          <w:rFonts w:ascii="Times New Roman" w:hAnsi="Times New Roman" w:cs="Times New Roman"/>
+        </w:rPr>
+      </w:pPr>
+    </w:p>
+    <w:p>
+      <w:pPr>
+        <w:pStyle w:val="Default"/>
+        <w:suppressAutoHyphens/>
+        <w:spacing w:before="0" w:line="240" w:lineRule="auto"/>
+        <w:rPr>
+          <w:rFonts w:ascii="Times New Roman" w:hAnsi="Times New Roman" w:cs="Times New Roman"/>
+        </w:rPr>
+      </w:pPr>
+    </w:p>
+    <w:p>
+      <w:pPr>
+        <w:pStyle w:val="Default"/>
+        <w:suppressAutoHyphens/>
+        <w:spacing w:before="0" w:line="240" w:lineRule="auto"/>
+        <w:rPr>
+          <w:rFonts w:ascii="Times New Roman" w:hAnsi="Times New Roman" w:cs="Times New Roman"/>
+        </w:rPr>
+      </w:pPr>
+    </w:p>
+    <w:p>
+      <w:pPr>
+        <w:pStyle w:val="Default"/>
+        <w:suppressAutoHyphens/>
+        <w:spacing w:before="0" w:line="240" w:lineRule="auto"/>
+        <w:rPr>
+          <w:rFonts w:ascii="Times New Roman" w:hAnsi="Times New Roman" w:cs="Times New Roman"/>
+        </w:rPr>
+      </w:pPr>
+    </w:p>
+    <w:p>
+      <w:pPr>
+        <w:pStyle w:val="Default"/>
+        <w:suppressAutoHyphens/>
+        <w:spacing w:before="0" w:line="240" w:lineRule="auto"/>
+        <w:rPr>
+          <w:rFonts w:ascii="Times New Roman" w:hAnsi="Times New Roman" w:cs="Times New Roman"/>
+        </w:rPr>
+      </w:pPr>
+    </w:p>
+    <w:p>
+      <w:pPr>
+        <w:pStyle w:val="Default"/>
+        <w:suppressAutoHyphens/>
+        <w:spacing w:before="0" w:line="240" w:lineRule="auto"/>
+        <w:rPr>
+          <w:rFonts w:ascii="Times New Roman" w:hAnsi="Times New Roman" w:cs="Times New Roman"/>
+        </w:rPr>
+      </w:pPr>
+    </w:p>
+    <w:p>
+      <w:pPr>
+        <w:pStyle w:val="Default"/>
+        <w:suppressAutoHyphens/>
+        <w:spacing w:before="0" w:line="240" w:lineRule="auto"/>
+        <w:rPr>
+          <w:rFonts w:ascii="Times New Roman" w:hAnsi="Times New Roman" w:cs="Times New Roman"/>
+        </w:rPr>
+      </w:pPr>
+    </w:p>
+    <w:p>
+      <w:pPr>
+        <w:pStyle w:val="Default"/>
+        <w:suppressAutoHyphens/>
+        <w:spacing w:before="0" w:line="240" w:lineRule="auto"/>
+        <w:rPr>
+          <w:rFonts w:ascii="Times New Roman" w:hAnsi="Times New Roman" w:cs="Times New Roman"/>
         </w:rPr>
       </w:pPr>
     </w:p>
@@ -2528,6 +2832,7 @@
           <w:bCs/>
           <w:lang w:val="fr-FR"/>
         </w:rPr>
+        <w:lastRenderedPageBreak/>
         <w:t xml:space="preserve">Section </w:t>
       </w:r>
       <w:r>
@@ -2604,6 +2909,14 @@
           <w:b/>
           <w:bCs/>
         </w:rPr>
+        <w:tab/>
+      </w:r>
+      <w:r>
+        <w:rPr>
+          <w:rFonts w:ascii="Times New Roman" w:hAnsi="Times New Roman" w:cs="Times New Roman"/>
+          <w:b/>
+          <w:bCs/>
+        </w:rPr>
         <w:t>(4</w:t>
       </w:r>
       <w:r>
@@ -2636,39 +2949,70 @@
         <w:rPr>
           <w:rFonts w:ascii="Times New Roman" w:hAnsi="Times New Roman" w:cs="Times New Roman"/>
         </w:rPr>
-        <w:t>27. Write about symbols. Write the steps to insert symbols.</w:t>
-      </w:r>
-    </w:p>
-    <w:p>
-      <w:pPr>
-        <w:pStyle w:val="Default"/>
-        <w:suppressAutoHyphens/>
-        <w:spacing w:before="0" w:line="240" w:lineRule="auto"/>
-        <w:rPr>
-          <w:rFonts w:ascii="Times New Roman" w:eastAsia="Times New Roman" w:hAnsi="Times New Roman" w:cs="Times New Roman"/>
-        </w:rPr>
-      </w:pPr>
-      <w:r>
-        <w:rPr>
-          <w:rFonts w:ascii="Times New Roman" w:hAnsi="Times New Roman" w:cs="Times New Roman"/>
-        </w:rPr>
-        <w:t>28. List any four causes of misuse of energy.</w:t>
-      </w:r>
-    </w:p>
-    <w:p>
-      <w:pPr>
-        <w:pStyle w:val="Default"/>
-        <w:suppressAutoHyphens/>
-        <w:spacing w:before="0" w:line="240" w:lineRule="auto"/>
-        <w:rPr>
-          <w:rFonts w:ascii="Times New Roman" w:eastAsia="Times New Roman" w:hAnsi="Times New Roman" w:cs="Times New Roman"/>
-        </w:rPr>
-      </w:pPr>
-      <w:r>
-        <w:rPr>
-          <w:rFonts w:ascii="Times New Roman" w:hAnsi="Times New Roman" w:cs="Times New Roman"/>
-        </w:rPr>
-        <w:t>29. Write two differences between plants and animals on the basis of reproduction.</w:t>
+        <w:t>11</w:t>
+      </w:r>
+      <w:r>
+        <w:rPr>
+          <w:rFonts w:ascii="Times New Roman" w:hAnsi="Times New Roman" w:cs="Times New Roman"/>
+        </w:rPr>
+        <w:t>. Write about symbols. Write the steps to insert symbols.</w:t>
+      </w:r>
+    </w:p>
+    <w:p>
+      <w:pPr>
+        <w:pStyle w:val="Default"/>
+        <w:suppressAutoHyphens/>
+        <w:spacing w:before="0" w:line="240" w:lineRule="auto"/>
+        <w:rPr>
+          <w:rFonts w:ascii="Times New Roman" w:eastAsia="Times New Roman" w:hAnsi="Times New Roman" w:cs="Times New Roman"/>
+        </w:rPr>
+      </w:pPr>
+      <w:r>
+        <w:rPr>
+          <w:rFonts w:ascii="Times New Roman" w:hAnsi="Times New Roman" w:cs="Times New Roman"/>
+        </w:rPr>
+        <w:t>12</w:t>
+      </w:r>
+      <w:r>
+        <w:rPr>
+          <w:rFonts w:ascii="Times New Roman" w:hAnsi="Times New Roman" w:cs="Times New Roman"/>
+        </w:rPr>
+        <w:t>. List any four causes of misuse of energy.</w:t>
+      </w:r>
+    </w:p>
+    <w:p>
+      <w:pPr>
+        <w:pStyle w:val="Default"/>
+        <w:suppressAutoHyphens/>
+        <w:spacing w:before="0" w:line="240" w:lineRule="auto"/>
+        <w:ind w:left="270" w:hanging="270"/>
+        <w:rPr>
+          <w:rFonts w:ascii="Times New Roman" w:eastAsia="Times New Roman" w:hAnsi="Times New Roman" w:cs="Times New Roman"/>
+        </w:rPr>
+      </w:pPr>
+      <w:r>
+        <w:rPr>
+          <w:rFonts w:ascii="Times New Roman" w:hAnsi="Times New Roman" w:cs="Times New Roman"/>
+        </w:rPr>
+        <w:t>13</w:t>
+      </w:r>
+      <w:r>
+        <w:rPr>
+          <w:rFonts w:ascii="Times New Roman" w:hAnsi="Times New Roman" w:cs="Times New Roman"/>
+        </w:rPr>
+        <w:t>. Write</w:t>
+      </w:r>
+      <w:r>
+        <w:rPr>
+          <w:rFonts w:ascii="Times New Roman" w:hAnsi="Times New Roman" w:cs="Times New Roman"/>
+        </w:rPr>
+        <w:t xml:space="preserve"> any</w:t>
+      </w:r>
+      <w:r>
+        <w:rPr>
+          <w:rFonts w:ascii="Times New Roman" w:hAnsi="Times New Roman" w:cs="Times New Roman"/>
+        </w:rPr>
+        <w:t xml:space="preserve"> two differences between plants and animals on the basis of reproduction.</w:t>
       </w:r>
     </w:p>
     <w:p>
@@ -2685,14 +3029,79 @@
         <w:rPr>
           <w:rFonts w:ascii="Times New Roman" w:hAnsi="Times New Roman" w:cs="Times New Roman"/>
         </w:rPr>
-        <w:t>30. Draw a diagram of No Horn</w:t>
-      </w:r>
-      <w:r>
-        <w:rPr>
-          <w:rFonts w:ascii="Times New Roman" w:hAnsi="Times New Roman" w:cs="Times New Roman"/>
+        <w:t>14</w:t>
+      </w:r>
+      <w:r>
+        <w:rPr>
+          <w:rFonts w:ascii="Times New Roman" w:hAnsi="Times New Roman" w:cs="Times New Roman"/>
+        </w:rPr>
+        <w:t xml:space="preserve">. Draw a diagram </w:t>
+      </w:r>
+      <w:r>
+        <w:rPr>
+          <w:rFonts w:ascii="Times New Roman" w:hAnsi="Times New Roman" w:cs="Times New Roman"/>
+        </w:rPr>
+        <w:t>of</w:t>
+      </w:r>
+      <w:r>
+        <w:rPr>
+          <w:rFonts w:ascii="Times New Roman" w:hAnsi="Times New Roman" w:cs="Times New Roman"/>
+        </w:rPr>
+        <w:t xml:space="preserve"> </w:t>
+      </w:r>
+      <w:r>
+        <w:rPr>
+          <w:rFonts w:ascii="Times New Roman" w:hAnsi="Times New Roman" w:cs="Times New Roman"/>
+        </w:rPr>
+        <w:t>+</w:t>
+      </w:r>
+      <w:r>
+        <w:rPr>
+          <w:rFonts w:ascii="Times New Roman" w:hAnsi="Times New Roman" w:cs="Times New Roman"/>
+        </w:rPr>
+        <w:t>“</w:t>
+      </w:r>
+      <w:r>
+        <w:rPr>
+          <w:rFonts w:ascii="Times New Roman" w:hAnsi="Times New Roman" w:cs="Times New Roman"/>
+          <w:b/>
+          <w:bCs/>
+        </w:rPr>
+        <w:t>No Horn</w:t>
+      </w:r>
+      <w:r>
+        <w:rPr>
+          <w:rFonts w:ascii="Times New Roman" w:hAnsi="Times New Roman" w:cs="Times New Roman"/>
+          <w:b/>
+          <w:bCs/>
           <w:lang w:val="it-IT"/>
         </w:rPr>
-        <w:t xml:space="preserve"> Zone symbol.</w:t>
+        <w:t xml:space="preserve"> Zone </w:t>
+      </w:r>
+      <w:r>
+        <w:rPr>
+          <w:rFonts w:ascii="Times New Roman" w:hAnsi="Times New Roman" w:cs="Times New Roman"/>
+          <w:b/>
+          <w:bCs/>
+          <w:lang w:val="it-IT"/>
+        </w:rPr>
+        <w:t>sign</w:t>
+      </w:r>
+      <w:r>
+        <w:rPr>
+          <w:rFonts w:ascii="Times New Roman" w:hAnsi="Times New Roman" w:cs="Times New Roman"/>
+          <w:b/>
+          <w:bCs/>
+          <w:lang w:val="it-IT"/>
+        </w:rPr>
+        <w:t>.</w:t>
+      </w:r>
+      <w:r>
+        <w:rPr>
+          <w:rFonts w:ascii="Times New Roman" w:hAnsi="Times New Roman" w:cs="Times New Roman"/>
+          <w:lang w:val="it-IT"/>
+        </w:rPr>
+        <w:t>”</w:t>
       </w:r>
     </w:p>
     <w:p>

</xml_diff>

<commit_message>
Remaining some proofing sent and invisilator list
</commit_message>
<xml_diff>
--- a/Received/five/5, science.docx
+++ b/Received/five/5, science.docx
@@ -349,6 +349,13 @@
         </w:rPr>
         <w:t>Sub: Science</w:t>
       </w:r>
+      <w:r>
+        <w:rPr>
+          <w:b/>
+          <w:bCs/>
+        </w:rPr>
+        <w:t xml:space="preserve"> and Technology</w:t>
+      </w:r>
     </w:p>
     <w:p>
       <w:pPr>
@@ -1780,7 +1787,55 @@
           <w:b/>
           <w:bCs/>
         </w:rPr>
-        <w:t>Very Short Answer Questions</w:t>
+        <w:t xml:space="preserve">Very </w:t>
+      </w:r>
+      <w:r>
+        <w:rPr>
+          <w:rFonts w:ascii="Times New Roman" w:hAnsi="Times New Roman" w:cs="Times New Roman"/>
+          <w:b/>
+          <w:bCs/>
+        </w:rPr>
+        <w:t>s</w:t>
+      </w:r>
+      <w:r>
+        <w:rPr>
+          <w:rFonts w:ascii="Times New Roman" w:hAnsi="Times New Roman" w:cs="Times New Roman"/>
+          <w:b/>
+          <w:bCs/>
+        </w:rPr>
+        <w:t xml:space="preserve">hort </w:t>
+      </w:r>
+      <w:r>
+        <w:rPr>
+          <w:rFonts w:ascii="Times New Roman" w:hAnsi="Times New Roman" w:cs="Times New Roman"/>
+          <w:b/>
+          <w:bCs/>
+        </w:rPr>
+        <w:t>a</w:t>
+      </w:r>
+      <w:r>
+        <w:rPr>
+          <w:rFonts w:ascii="Times New Roman" w:hAnsi="Times New Roman" w:cs="Times New Roman"/>
+          <w:b/>
+          <w:bCs/>
+        </w:rPr>
+        <w:t xml:space="preserve">nswer </w:t>
+      </w:r>
+      <w:r>
+        <w:rPr>
+          <w:rFonts w:ascii="Times New Roman" w:hAnsi="Times New Roman" w:cs="Times New Roman"/>
+          <w:b/>
+          <w:bCs/>
+        </w:rPr>
+        <w:t>q</w:t>
+      </w:r>
+      <w:r>
+        <w:rPr>
+          <w:rFonts w:ascii="Times New Roman" w:hAnsi="Times New Roman" w:cs="Times New Roman"/>
+          <w:b/>
+          <w:bCs/>
+        </w:rPr>
+        <w:t>uestions</w:t>
       </w:r>
       <w:r>
         <w:rPr>
@@ -1853,6 +1908,7 @@
         <w:pStyle w:val="Default"/>
         <w:suppressAutoHyphens/>
         <w:spacing w:before="0" w:line="240" w:lineRule="auto"/>
+        <w:ind w:left="270"/>
         <w:rPr>
           <w:rFonts w:ascii="Times New Roman" w:eastAsia="Times New Roman" w:hAnsi="Times New Roman" w:cs="Times New Roman"/>
         </w:rPr>
@@ -1875,6 +1931,7 @@
         <w:pStyle w:val="Default"/>
         <w:suppressAutoHyphens/>
         <w:spacing w:before="0" w:line="240" w:lineRule="auto"/>
+        <w:ind w:left="270"/>
         <w:rPr>
           <w:rFonts w:ascii="Times New Roman" w:eastAsia="Times New Roman" w:hAnsi="Times New Roman" w:cs="Times New Roman"/>
         </w:rPr>
@@ -1909,6 +1966,7 @@
         <w:pStyle w:val="Default"/>
         <w:suppressAutoHyphens/>
         <w:spacing w:before="0" w:line="240" w:lineRule="auto"/>
+        <w:ind w:left="270"/>
         <w:rPr>
           <w:rFonts w:ascii="Times New Roman" w:eastAsia="Times New Roman" w:hAnsi="Times New Roman" w:cs="Times New Roman"/>
         </w:rPr>
@@ -1931,6 +1989,7 @@
         <w:pStyle w:val="Default"/>
         <w:suppressAutoHyphens/>
         <w:spacing w:before="0" w:line="240" w:lineRule="auto"/>
+        <w:ind w:left="270"/>
         <w:rPr>
           <w:rFonts w:ascii="Times New Roman" w:eastAsia="Times New Roman" w:hAnsi="Times New Roman" w:cs="Times New Roman"/>
         </w:rPr>
@@ -1953,6 +2012,7 @@
         <w:pStyle w:val="Default"/>
         <w:suppressAutoHyphens/>
         <w:spacing w:before="0" w:line="240" w:lineRule="auto"/>
+        <w:ind w:left="270"/>
         <w:rPr>
           <w:rFonts w:ascii="Times New Roman" w:eastAsia="Times New Roman" w:hAnsi="Times New Roman" w:cs="Times New Roman"/>
         </w:rPr>
@@ -1975,6 +2035,7 @@
         <w:pStyle w:val="Default"/>
         <w:suppressAutoHyphens/>
         <w:spacing w:before="0" w:line="240" w:lineRule="auto"/>
+        <w:ind w:left="270"/>
         <w:rPr>
           <w:rFonts w:ascii="Times New Roman" w:eastAsia="Times New Roman" w:hAnsi="Times New Roman" w:cs="Times New Roman"/>
         </w:rPr>
@@ -1997,6 +2058,7 @@
         <w:pStyle w:val="Default"/>
         <w:suppressAutoHyphens/>
         <w:spacing w:before="0" w:line="240" w:lineRule="auto"/>
+        <w:ind w:left="270"/>
         <w:rPr>
           <w:rFonts w:ascii="Times New Roman" w:hAnsi="Times New Roman" w:cs="Times New Roman"/>
         </w:rPr>
@@ -2019,6 +2081,7 @@
         <w:pStyle w:val="Default"/>
         <w:suppressAutoHyphens/>
         <w:spacing w:before="0" w:line="240" w:lineRule="auto"/>
+        <w:ind w:left="270"/>
         <w:rPr>
           <w:rFonts w:ascii="Times New Roman" w:eastAsia="Times New Roman" w:hAnsi="Times New Roman" w:cs="Times New Roman"/>
         </w:rPr>
@@ -2082,7 +2145,7 @@
           <w:bCs/>
           <w:lang w:val="it-IT"/>
         </w:rPr>
-        <w:t>Short Answer Questions</w:t>
+        <w:t xml:space="preserve">Short </w:t>
       </w:r>
       <w:r>
         <w:rPr>
@@ -2091,6 +2154,42 @@
           <w:bCs/>
           <w:lang w:val="it-IT"/>
         </w:rPr>
+        <w:t>a</w:t>
+      </w:r>
+      <w:r>
+        <w:rPr>
+          <w:rFonts w:ascii="Times New Roman" w:hAnsi="Times New Roman" w:cs="Times New Roman"/>
+          <w:b/>
+          <w:bCs/>
+          <w:lang w:val="it-IT"/>
+        </w:rPr>
+        <w:t xml:space="preserve">nswer </w:t>
+      </w:r>
+      <w:r>
+        <w:rPr>
+          <w:rFonts w:ascii="Times New Roman" w:hAnsi="Times New Roman" w:cs="Times New Roman"/>
+          <w:b/>
+          <w:bCs/>
+          <w:lang w:val="it-IT"/>
+        </w:rPr>
+        <w:t>q</w:t>
+      </w:r>
+      <w:r>
+        <w:rPr>
+          <w:rFonts w:ascii="Times New Roman" w:hAnsi="Times New Roman" w:cs="Times New Roman"/>
+          <w:b/>
+          <w:bCs/>
+          <w:lang w:val="it-IT"/>
+        </w:rPr>
+        <w:t>uestions</w:t>
+      </w:r>
+      <w:r>
+        <w:rPr>
+          <w:rFonts w:ascii="Times New Roman" w:hAnsi="Times New Roman" w:cs="Times New Roman"/>
+          <w:b/>
+          <w:bCs/>
+          <w:lang w:val="it-IT"/>
+        </w:rPr>
         <w:t>.</w:t>
       </w:r>
       <w:r>
@@ -2203,6 +2302,7 @@
         <w:pStyle w:val="Default"/>
         <w:suppressAutoHyphens/>
         <w:spacing w:before="0" w:line="240" w:lineRule="auto"/>
+        <w:ind w:left="360"/>
         <w:rPr>
           <w:rFonts w:ascii="Times New Roman" w:eastAsia="Times New Roman" w:hAnsi="Times New Roman" w:cs="Times New Roman"/>
         </w:rPr>
@@ -2219,6 +2319,7 @@
         <w:pStyle w:val="Default"/>
         <w:suppressAutoHyphens/>
         <w:spacing w:before="0" w:line="240" w:lineRule="auto"/>
+        <w:ind w:left="360"/>
         <w:rPr>
           <w:rFonts w:ascii="Times New Roman" w:hAnsi="Times New Roman" w:cs="Times New Roman"/>
         </w:rPr>
@@ -2345,6 +2446,7 @@
         <w:pStyle w:val="Default"/>
         <w:suppressAutoHyphens/>
         <w:spacing w:before="0" w:line="240" w:lineRule="auto"/>
+        <w:ind w:left="360"/>
         <w:rPr>
           <w:rFonts w:ascii="Times New Roman" w:eastAsia="Times New Roman" w:hAnsi="Times New Roman" w:cs="Times New Roman"/>
         </w:rPr>
@@ -2361,6 +2463,7 @@
         <w:pStyle w:val="Default"/>
         <w:suppressAutoHyphens/>
         <w:spacing w:before="0" w:line="240" w:lineRule="auto"/>
+        <w:ind w:left="360"/>
         <w:rPr>
           <w:rFonts w:ascii="Times New Roman" w:eastAsia="Times New Roman" w:hAnsi="Times New Roman" w:cs="Times New Roman"/>
         </w:rPr>
@@ -2861,7 +2964,55 @@
           <w:b/>
           <w:bCs/>
         </w:rPr>
-        <w:t>Long Question Answer</w:t>
+        <w:t xml:space="preserve">Long </w:t>
+      </w:r>
+      <w:r>
+        <w:rPr>
+          <w:rFonts w:ascii="Times New Roman" w:hAnsi="Times New Roman" w:cs="Times New Roman"/>
+          <w:b/>
+          <w:bCs/>
+        </w:rPr>
+        <w:t>a</w:t>
+      </w:r>
+      <w:r>
+        <w:rPr>
+          <w:rFonts w:ascii="Times New Roman" w:hAnsi="Times New Roman" w:cs="Times New Roman"/>
+          <w:b/>
+          <w:bCs/>
+        </w:rPr>
+        <w:t>nswer</w:t>
+      </w:r>
+      <w:r>
+        <w:rPr>
+          <w:rFonts w:ascii="Times New Roman" w:hAnsi="Times New Roman" w:cs="Times New Roman"/>
+          <w:b/>
+          <w:bCs/>
+        </w:rPr>
+        <w:t xml:space="preserve"> </w:t>
+      </w:r>
+      <w:r>
+        <w:rPr>
+          <w:rFonts w:ascii="Times New Roman" w:hAnsi="Times New Roman" w:cs="Times New Roman"/>
+          <w:b/>
+          <w:bCs/>
+        </w:rPr>
+        <w:t>q</w:t>
+      </w:r>
+      <w:r>
+        <w:rPr>
+          <w:rFonts w:ascii="Times New Roman" w:hAnsi="Times New Roman" w:cs="Times New Roman"/>
+          <w:b/>
+          <w:bCs/>
+        </w:rPr>
+        <w:t>uestion</w:t>
+      </w:r>
+      <w:r>
+        <w:rPr>
+          <w:rFonts w:ascii="Times New Roman" w:hAnsi="Times New Roman" w:cs="Times New Roman"/>
+          <w:b/>
+          <w:bCs/>
+        </w:rPr>
+        <w:t>s</w:t>
       </w:r>
       <w:r>
         <w:rPr>

</xml_diff>